<commit_message>
Partners logos, Google Maps embed, Serrua Digital footer credit
</commit_message>
<xml_diff>
--- a/Company Profile/Enviestudos Company Profile 2025_05_14.docx
+++ b/Company Profile/Enviestudos Company Profile 2025_05_14.docx
@@ -4,7 +4,7 @@
   <w:body>
     <w:p>
       <w:pPr>
-        <w:pStyle w:val="Corpodetexto"/>
+        <w:pStyle w:val="BodyText"/>
         <w:rPr>
           <w:rFonts w:ascii="Times New Roman"/>
         </w:rPr>
@@ -236,7 +236,7 @@
     </w:p>
     <w:p>
       <w:pPr>
-        <w:pStyle w:val="Corpodetexto"/>
+        <w:pStyle w:val="BodyText"/>
         <w:spacing w:before="1"/>
         <w:rPr>
           <w:rFonts w:ascii="Times New Roman"/>
@@ -246,7 +246,7 @@
     </w:p>
     <w:p>
       <w:pPr>
-        <w:pStyle w:val="Corpodetexto"/>
+        <w:pStyle w:val="BodyText"/>
         <w:ind w:left="7654"/>
         <w:rPr>
           <w:rFonts w:ascii="Times New Roman"/>
@@ -361,7 +361,7 @@
     </w:p>
     <w:p>
       <w:pPr>
-        <w:pStyle w:val="Ttulo2"/>
+        <w:pStyle w:val="Heading2"/>
         <w:spacing w:before="3"/>
         <w:ind w:left="854"/>
         <w:jc w:val="left"/>
@@ -404,7 +404,7 @@
     </w:p>
     <w:p>
       <w:pPr>
-        <w:pStyle w:val="Corpodetexto"/>
+        <w:pStyle w:val="BodyText"/>
         <w:rPr>
           <w:b/>
           <w:sz w:val="24"/>
@@ -414,7 +414,7 @@
     </w:p>
     <w:p>
       <w:pPr>
-        <w:pStyle w:val="Corpodetexto"/>
+        <w:pStyle w:val="BodyText"/>
         <w:rPr>
           <w:b/>
           <w:sz w:val="24"/>
@@ -424,7 +424,7 @@
     </w:p>
     <w:p>
       <w:pPr>
-        <w:pStyle w:val="Corpodetexto"/>
+        <w:pStyle w:val="BodyText"/>
         <w:rPr>
           <w:b/>
           <w:sz w:val="24"/>
@@ -434,7 +434,7 @@
     </w:p>
     <w:p>
       <w:pPr>
-        <w:pStyle w:val="Corpodetexto"/>
+        <w:pStyle w:val="BodyText"/>
         <w:rPr>
           <w:b/>
           <w:sz w:val="24"/>
@@ -444,7 +444,7 @@
     </w:p>
     <w:p>
       <w:pPr>
-        <w:pStyle w:val="Corpodetexto"/>
+        <w:pStyle w:val="BodyText"/>
         <w:rPr>
           <w:b/>
           <w:sz w:val="24"/>
@@ -844,12 +844,14 @@
                               </w:rPr>
                               <w:t xml:space="preserve"> </w:t>
                             </w:r>
+                            <w:proofErr w:type="spellStart"/>
                             <w:r>
                               <w:rPr>
                                 <w:sz w:val="14"/>
                               </w:rPr>
                               <w:t>Cidade</w:t>
                             </w:r>
+                            <w:proofErr w:type="spellEnd"/>
                             <w:r>
                               <w:rPr>
                                 <w:spacing w:val="-3"/>
@@ -1247,12 +1249,14 @@
                         </w:rPr>
                         <w:t xml:space="preserve"> </w:t>
                       </w:r>
+                      <w:proofErr w:type="spellStart"/>
                       <w:r>
                         <w:rPr>
                           <w:sz w:val="14"/>
                         </w:rPr>
                         <w:t>Cidade</w:t>
                       </w:r>
+                      <w:proofErr w:type="spellEnd"/>
                       <w:r>
                         <w:rPr>
                           <w:spacing w:val="-3"/>
@@ -1304,7 +1308,7 @@
     </w:p>
     <w:p>
       <w:pPr>
-        <w:pStyle w:val="Corpodetexto"/>
+        <w:pStyle w:val="BodyText"/>
         <w:rPr>
           <w:b/>
           <w:sz w:val="24"/>
@@ -1314,7 +1318,7 @@
     </w:p>
     <w:p>
       <w:pPr>
-        <w:pStyle w:val="Corpodetexto"/>
+        <w:pStyle w:val="BodyText"/>
         <w:rPr>
           <w:b/>
           <w:sz w:val="24"/>
@@ -1324,7 +1328,7 @@
     </w:p>
     <w:p>
       <w:pPr>
-        <w:pStyle w:val="Corpodetexto"/>
+        <w:pStyle w:val="BodyText"/>
         <w:rPr>
           <w:b/>
           <w:sz w:val="24"/>
@@ -1334,7 +1338,7 @@
     </w:p>
     <w:p>
       <w:pPr>
-        <w:pStyle w:val="Corpodetexto"/>
+        <w:pStyle w:val="BodyText"/>
         <w:rPr>
           <w:b/>
           <w:sz w:val="24"/>
@@ -1344,7 +1348,7 @@
     </w:p>
     <w:p>
       <w:pPr>
-        <w:pStyle w:val="Corpodetexto"/>
+        <w:pStyle w:val="BodyText"/>
         <w:rPr>
           <w:b/>
           <w:sz w:val="24"/>
@@ -1354,7 +1358,7 @@
     </w:p>
     <w:p>
       <w:pPr>
-        <w:pStyle w:val="Corpodetexto"/>
+        <w:pStyle w:val="BodyText"/>
         <w:rPr>
           <w:b/>
           <w:sz w:val="24"/>
@@ -1364,7 +1368,7 @@
     </w:p>
     <w:p>
       <w:pPr>
-        <w:pStyle w:val="Corpodetexto"/>
+        <w:pStyle w:val="BodyText"/>
         <w:rPr>
           <w:b/>
           <w:sz w:val="24"/>
@@ -1374,7 +1378,7 @@
     </w:p>
     <w:p>
       <w:pPr>
-        <w:pStyle w:val="Corpodetexto"/>
+        <w:pStyle w:val="BodyText"/>
         <w:rPr>
           <w:b/>
           <w:sz w:val="24"/>
@@ -1384,7 +1388,7 @@
     </w:p>
     <w:p>
       <w:pPr>
-        <w:pStyle w:val="Corpodetexto"/>
+        <w:pStyle w:val="BodyText"/>
         <w:rPr>
           <w:b/>
           <w:sz w:val="24"/>
@@ -1394,7 +1398,7 @@
     </w:p>
     <w:p>
       <w:pPr>
-        <w:pStyle w:val="Corpodetexto"/>
+        <w:pStyle w:val="BodyText"/>
         <w:spacing w:before="7"/>
         <w:rPr>
           <w:b/>
@@ -1405,7 +1409,7 @@
     </w:p>
     <w:p>
       <w:pPr>
-        <w:pStyle w:val="Ttulo"/>
+        <w:pStyle w:val="Title"/>
         <w:rPr>
           <w:rFonts w:asciiTheme="minorHAnsi" w:hAnsiTheme="minorHAnsi" w:cstheme="minorHAnsi"/>
           <w:lang w:val="pt-PT"/>
@@ -7045,7 +7049,7 @@
     </w:p>
     <w:p>
       <w:pPr>
-        <w:pStyle w:val="Corpodetexto"/>
+        <w:pStyle w:val="BodyText"/>
         <w:rPr>
           <w:rFonts w:asciiTheme="minorHAnsi" w:hAnsiTheme="minorHAnsi" w:cstheme="minorHAnsi"/>
           <w:b/>
@@ -7217,7 +7221,7 @@
     </w:p>
     <w:p>
       <w:pPr>
-        <w:pStyle w:val="Corpodetexto"/>
+        <w:pStyle w:val="BodyText"/>
         <w:spacing w:line="239" w:lineRule="exact"/>
         <w:ind w:left="5937"/>
         <w:rPr>
@@ -7421,7 +7425,7 @@
     </w:p>
     <w:p>
       <w:pPr>
-        <w:pStyle w:val="Corpodetexto"/>
+        <w:pStyle w:val="BodyText"/>
         <w:spacing w:before="3"/>
         <w:rPr>
           <w:rFonts w:asciiTheme="minorHAnsi" w:hAnsiTheme="minorHAnsi" w:cstheme="minorHAnsi"/>
@@ -7491,12 +7495,21 @@
               </w:rPr>
               <w:t xml:space="preserve"> </w:t>
             </w:r>
+            <w:proofErr w:type="spellStart"/>
             <w:r>
               <w:rPr>
                 <w:rFonts w:asciiTheme="minorHAnsi" w:hAnsiTheme="minorHAnsi" w:cstheme="minorHAnsi"/>
                 <w:b/>
               </w:rPr>
-              <w:t>Campany:</w:t>
+              <w:t>Campany</w:t>
+            </w:r>
+            <w:proofErr w:type="spellEnd"/>
+            <w:r>
+              <w:rPr>
+                <w:rFonts w:asciiTheme="minorHAnsi" w:hAnsiTheme="minorHAnsi" w:cstheme="minorHAnsi"/>
+                <w:b/>
+              </w:rPr>
+              <w:t>:</w:t>
             </w:r>
           </w:p>
         </w:tc>
@@ -8104,7 +8117,7 @@
     </w:tbl>
     <w:p>
       <w:pPr>
-        <w:pStyle w:val="Corpodetexto"/>
+        <w:pStyle w:val="BodyText"/>
         <w:rPr>
           <w:b/>
         </w:rPr>
@@ -8112,7 +8125,7 @@
     </w:p>
     <w:p>
       <w:pPr>
-        <w:pStyle w:val="Corpodetexto"/>
+        <w:pStyle w:val="BodyText"/>
         <w:rPr>
           <w:b/>
         </w:rPr>
@@ -8120,7 +8133,7 @@
     </w:p>
     <w:p>
       <w:pPr>
-        <w:pStyle w:val="Corpodetexto"/>
+        <w:pStyle w:val="BodyText"/>
         <w:rPr>
           <w:b/>
         </w:rPr>
@@ -8128,7 +8141,7 @@
     </w:p>
     <w:p>
       <w:pPr>
-        <w:pStyle w:val="Corpodetexto"/>
+        <w:pStyle w:val="BodyText"/>
         <w:rPr>
           <w:b/>
         </w:rPr>
@@ -8136,7 +8149,7 @@
     </w:p>
     <w:p>
       <w:pPr>
-        <w:pStyle w:val="Corpodetexto"/>
+        <w:pStyle w:val="BodyText"/>
         <w:rPr>
           <w:b/>
         </w:rPr>
@@ -8144,7 +8157,7 @@
     </w:p>
     <w:p>
       <w:pPr>
-        <w:pStyle w:val="Corpodetexto"/>
+        <w:pStyle w:val="BodyText"/>
         <w:rPr>
           <w:b/>
         </w:rPr>
@@ -8152,7 +8165,7 @@
     </w:p>
     <w:p>
       <w:pPr>
-        <w:pStyle w:val="Corpodetexto"/>
+        <w:pStyle w:val="BodyText"/>
         <w:rPr>
           <w:b/>
         </w:rPr>
@@ -8160,7 +8173,7 @@
     </w:p>
     <w:p>
       <w:pPr>
-        <w:pStyle w:val="Corpodetexto"/>
+        <w:pStyle w:val="BodyText"/>
         <w:rPr>
           <w:b/>
         </w:rPr>
@@ -8168,7 +8181,7 @@
     </w:p>
     <w:p>
       <w:pPr>
-        <w:pStyle w:val="Corpodetexto"/>
+        <w:pStyle w:val="BodyText"/>
         <w:rPr>
           <w:b/>
         </w:rPr>
@@ -8176,7 +8189,7 @@
     </w:p>
     <w:p>
       <w:pPr>
-        <w:pStyle w:val="Corpodetexto"/>
+        <w:pStyle w:val="BodyText"/>
         <w:rPr>
           <w:b/>
         </w:rPr>
@@ -8184,7 +8197,7 @@
     </w:p>
     <w:p>
       <w:pPr>
-        <w:pStyle w:val="Corpodetexto"/>
+        <w:pStyle w:val="BodyText"/>
         <w:spacing w:before="4"/>
         <w:rPr>
           <w:b/>
@@ -8499,7 +8512,7 @@
     </w:p>
     <w:p>
       <w:pPr>
-        <w:pStyle w:val="Corpodetexto"/>
+        <w:pStyle w:val="BodyText"/>
         <w:numPr>
           <w:ilvl w:val="0"/>
           <w:numId w:val="6"/>
@@ -9105,12 +9118,14 @@
                               </w:rPr>
                               <w:t xml:space="preserve"> </w:t>
                             </w:r>
+                            <w:proofErr w:type="spellStart"/>
                             <w:r>
                               <w:rPr>
                                 <w:sz w:val="14"/>
                               </w:rPr>
                               <w:t>Cidade</w:t>
                             </w:r>
+                            <w:proofErr w:type="spellEnd"/>
                             <w:r>
                               <w:rPr>
                                 <w:spacing w:val="-3"/>
@@ -9464,12 +9479,14 @@
                         </w:rPr>
                         <w:t xml:space="preserve"> </w:t>
                       </w:r>
+                      <w:proofErr w:type="spellStart"/>
                       <w:r>
                         <w:rPr>
                           <w:sz w:val="14"/>
                         </w:rPr>
                         <w:t>Cidade</w:t>
                       </w:r>
+                      <w:proofErr w:type="spellEnd"/>
                       <w:r>
                         <w:rPr>
                           <w:spacing w:val="-3"/>
@@ -9539,13 +9556,41 @@
           <w:lang w:val="en"/>
         </w:rPr>
       </w:pPr>
+      <w:proofErr w:type="spellStart"/>
       <w:r>
         <w:rPr>
           <w:rStyle w:val="q4iawc"/>
           <w:rFonts w:asciiTheme="minorHAnsi" w:hAnsiTheme="minorHAnsi" w:cstheme="minorHAnsi"/>
           <w:lang w:val="en"/>
         </w:rPr>
-        <w:t>Enviestudos, Lda. (EEL) is a private company that provides environmental consultancy and services, constituted on the 9th of June 2011, in the light of the legislation in force in the country, by individual consultants, with extensive professional experience in the national market.</w:t>
+        <w:t>Enviestudos</w:t>
+      </w:r>
+      <w:proofErr w:type="spellEnd"/>
+      <w:r>
+        <w:rPr>
+          <w:rStyle w:val="q4iawc"/>
+          <w:rFonts w:asciiTheme="minorHAnsi" w:hAnsiTheme="minorHAnsi" w:cstheme="minorHAnsi"/>
+          <w:lang w:val="en"/>
+        </w:rPr>
+        <w:t xml:space="preserve">, </w:t>
+      </w:r>
+      <w:proofErr w:type="spellStart"/>
+      <w:r>
+        <w:rPr>
+          <w:rStyle w:val="q4iawc"/>
+          <w:rFonts w:asciiTheme="minorHAnsi" w:hAnsiTheme="minorHAnsi" w:cstheme="minorHAnsi"/>
+          <w:lang w:val="en"/>
+        </w:rPr>
+        <w:t>Lda</w:t>
+      </w:r>
+      <w:proofErr w:type="spellEnd"/>
+      <w:r>
+        <w:rPr>
+          <w:rStyle w:val="q4iawc"/>
+          <w:rFonts w:asciiTheme="minorHAnsi" w:hAnsiTheme="minorHAnsi" w:cstheme="minorHAnsi"/>
+          <w:lang w:val="en"/>
+        </w:rPr>
+        <w:t>. (EEL) is a private company that provides environmental consultancy and services, constituted on the 9th of June 2011, in the light of the legislation in force in the country, by individual consultants, with extensive professional experience in the national market.</w:t>
       </w:r>
     </w:p>
     <w:p>
@@ -9666,7 +9711,7 @@
     </w:p>
     <w:p>
       <w:pPr>
-        <w:pStyle w:val="Corpodetexto"/>
+        <w:pStyle w:val="BodyText"/>
         <w:numPr>
           <w:ilvl w:val="0"/>
           <w:numId w:val="6"/>
@@ -9715,13 +9760,49 @@
           <w:bCs/>
           <w:lang w:val="en"/>
         </w:rPr>
-        <w:t xml:space="preserve">ESIA for the Port Infrastructure Construction project in Chongoene, Gaza Province. </w:t>
+        <w:t xml:space="preserve">ESIA for the Port Infrastructure Construction project in </w:t>
+      </w:r>
+      <w:proofErr w:type="spellStart"/>
+      <w:r>
+        <w:rPr>
+          <w:rStyle w:val="q4iawc"/>
+          <w:rFonts w:asciiTheme="minorHAnsi" w:hAnsiTheme="minorHAnsi" w:cstheme="minorHAnsi"/>
+          <w:b/>
+          <w:bCs/>
+          <w:lang w:val="en"/>
+        </w:rPr>
+        <w:t>Chongoene</w:t>
+      </w:r>
+      <w:proofErr w:type="spellEnd"/>
+      <w:r>
+        <w:rPr>
+          <w:rStyle w:val="q4iawc"/>
+          <w:rFonts w:asciiTheme="minorHAnsi" w:hAnsiTheme="minorHAnsi" w:cstheme="minorHAnsi"/>
+          <w:b/>
+          <w:bCs/>
+          <w:lang w:val="en"/>
+        </w:rPr>
+        <w:t xml:space="preserve">, Gaza Province. </w:t>
       </w:r>
       <w:r>
         <w:rPr>
           <w:rFonts w:asciiTheme="minorHAnsi" w:eastAsiaTheme="minorHAnsi" w:hAnsiTheme="minorHAnsi" w:cstheme="minorHAnsi"/>
         </w:rPr>
-        <w:t xml:space="preserve">Preparation of Pre-feasibility and Environmental Scoping Report and ToR for ESIA, public consultation meetings and Preparation of ESIA Report, including ESMP. </w:t>
+        <w:t xml:space="preserve">Preparation of Pre-feasibility and Environmental Scoping Report and </w:t>
+      </w:r>
+      <w:proofErr w:type="spellStart"/>
+      <w:r>
+        <w:rPr>
+          <w:rFonts w:asciiTheme="minorHAnsi" w:eastAsiaTheme="minorHAnsi" w:hAnsiTheme="minorHAnsi" w:cstheme="minorHAnsi"/>
+        </w:rPr>
+        <w:t>ToR</w:t>
+      </w:r>
+      <w:proofErr w:type="spellEnd"/>
+      <w:r>
+        <w:rPr>
+          <w:rFonts w:asciiTheme="minorHAnsi" w:eastAsiaTheme="minorHAnsi" w:hAnsiTheme="minorHAnsi" w:cstheme="minorHAnsi"/>
+        </w:rPr>
+        <w:t xml:space="preserve"> for ESIA, public consultation meetings and Preparation of ESIA Report, including ESMP. </w:t>
       </w:r>
       <w:r>
         <w:rPr>
@@ -9737,13 +9818,23 @@
         </w:rPr>
         <w:t xml:space="preserve">. Prepared for </w:t>
       </w:r>
+      <w:proofErr w:type="spellStart"/>
       <w:r>
         <w:rPr>
           <w:rStyle w:val="q4iawc"/>
           <w:rFonts w:asciiTheme="minorHAnsi" w:hAnsiTheme="minorHAnsi" w:cstheme="minorHAnsi"/>
           <w:lang w:val="en"/>
         </w:rPr>
-        <w:t>Dingsheng Minerais, SA</w:t>
+        <w:t>Dingsheng</w:t>
+      </w:r>
+      <w:proofErr w:type="spellEnd"/>
+      <w:r>
+        <w:rPr>
+          <w:rStyle w:val="q4iawc"/>
+          <w:rFonts w:asciiTheme="minorHAnsi" w:hAnsiTheme="minorHAnsi" w:cstheme="minorHAnsi"/>
+          <w:lang w:val="en"/>
+        </w:rPr>
+        <w:t xml:space="preserve"> Minerais, SA</w:t>
       </w:r>
       <w:r>
         <w:rPr>
@@ -9767,7 +9858,23 @@
           <w:rFonts w:asciiTheme="minorHAnsi" w:hAnsiTheme="minorHAnsi" w:cstheme="minorHAnsi"/>
           <w:bCs/>
         </w:rPr>
-        <w:t xml:space="preserve"> JIang ZhaoYao and Li Daowen</w:t>
+        <w:t xml:space="preserve"> </w:t>
+      </w:r>
+      <w:proofErr w:type="spellStart"/>
+      <w:r>
+        <w:rPr>
+          <w:rFonts w:asciiTheme="minorHAnsi" w:hAnsiTheme="minorHAnsi" w:cstheme="minorHAnsi"/>
+          <w:bCs/>
+        </w:rPr>
+        <w:t>JIang</w:t>
+      </w:r>
+      <w:proofErr w:type="spellEnd"/>
+      <w:r>
+        <w:rPr>
+          <w:rFonts w:asciiTheme="minorHAnsi" w:hAnsiTheme="minorHAnsi" w:cstheme="minorHAnsi"/>
+          <w:bCs/>
+        </w:rPr>
+        <w:t xml:space="preserve"> ZhaoYao and Li Daowen</w:t>
       </w:r>
       <w:r>
         <w:rPr>
@@ -9857,16 +9964,9 @@
           <w:bCs/>
           <w:lang w:val="en"/>
         </w:rPr>
-        <w:t xml:space="preserve">, Sofala Province. </w:t>
-      </w:r>
-      <w:r>
-        <w:rPr>
-          <w:rStyle w:val="q4iawc"/>
-          <w:rFonts w:asciiTheme="minorHAnsi" w:hAnsiTheme="minorHAnsi" w:cstheme="minorHAnsi"/>
-          <w:lang w:val="en"/>
-        </w:rPr>
-        <w:t xml:space="preserve">Preparation of the Abbreviated Resettlement Action Plan (ARAP) in accordance with WB policies and procedures; Preparation of Grievance Resolution Mechanism in compliance with FIPAG WASIS II safeguards (ESMF and RPF) and a Specific Gender-Based Violence (GBV) Mechanism, including areas of risk, as well as Sexual Exploitation and Abuse (SEA); Sexual Harassment in the Workplace; Human trafficking; and Non-Sexual Exploitative Abuse. </w:t>
-      </w:r>
+        <w:t xml:space="preserve">, </w:t>
+      </w:r>
+      <w:proofErr w:type="spellStart"/>
       <w:r>
         <w:rPr>
           <w:rStyle w:val="q4iawc"/>
@@ -9875,6 +9975,35 @@
           <w:bCs/>
           <w:lang w:val="en"/>
         </w:rPr>
+        <w:t>Sofala</w:t>
+      </w:r>
+      <w:proofErr w:type="spellEnd"/>
+      <w:r>
+        <w:rPr>
+          <w:rStyle w:val="q4iawc"/>
+          <w:rFonts w:asciiTheme="minorHAnsi" w:hAnsiTheme="minorHAnsi" w:cstheme="minorHAnsi"/>
+          <w:b/>
+          <w:bCs/>
+          <w:lang w:val="en"/>
+        </w:rPr>
+        <w:t xml:space="preserve"> Province. </w:t>
+      </w:r>
+      <w:r>
+        <w:rPr>
+          <w:rStyle w:val="q4iawc"/>
+          <w:rFonts w:asciiTheme="minorHAnsi" w:hAnsiTheme="minorHAnsi" w:cstheme="minorHAnsi"/>
+          <w:lang w:val="en"/>
+        </w:rPr>
+        <w:t xml:space="preserve">Preparation of the Abbreviated Resettlement Action Plan (ARAP) in accordance with WB policies and procedures; Preparation of Grievance Resolution Mechanism in compliance with FIPAG WASIS II safeguards (ESMF and RPF) and a Specific Gender-Based Violence (GBV) Mechanism, including areas of risk, as well as Sexual Exploitation and Abuse (SEA); Sexual Harassment in the Workplace; Human trafficking; and Non-Sexual Exploitative Abuse. </w:t>
+      </w:r>
+      <w:r>
+        <w:rPr>
+          <w:rStyle w:val="q4iawc"/>
+          <w:rFonts w:asciiTheme="minorHAnsi" w:hAnsiTheme="minorHAnsi" w:cstheme="minorHAnsi"/>
+          <w:b/>
+          <w:bCs/>
+          <w:lang w:val="en"/>
+        </w:rPr>
         <w:t>Financed by WB.</w:t>
       </w:r>
       <w:r>
@@ -9883,7 +10012,43 @@
           <w:rFonts w:asciiTheme="minorHAnsi" w:hAnsiTheme="minorHAnsi" w:cstheme="minorHAnsi"/>
           <w:lang w:val="en"/>
         </w:rPr>
-        <w:t xml:space="preserve"> Prepared to Ingerop Moçambique, Lda. &amp; GAUFF Eng</w:t>
+        <w:t xml:space="preserve"> Prepared to </w:t>
+      </w:r>
+      <w:proofErr w:type="spellStart"/>
+      <w:r>
+        <w:rPr>
+          <w:rStyle w:val="q4iawc"/>
+          <w:rFonts w:asciiTheme="minorHAnsi" w:hAnsiTheme="minorHAnsi" w:cstheme="minorHAnsi"/>
+          <w:lang w:val="en"/>
+        </w:rPr>
+        <w:t>Ingerop</w:t>
+      </w:r>
+      <w:proofErr w:type="spellEnd"/>
+      <w:r>
+        <w:rPr>
+          <w:rStyle w:val="q4iawc"/>
+          <w:rFonts w:asciiTheme="minorHAnsi" w:hAnsiTheme="minorHAnsi" w:cstheme="minorHAnsi"/>
+          <w:lang w:val="en"/>
+        </w:rPr>
+        <w:t xml:space="preserve"> Moçambique, </w:t>
+      </w:r>
+      <w:proofErr w:type="spellStart"/>
+      <w:r>
+        <w:rPr>
+          <w:rStyle w:val="q4iawc"/>
+          <w:rFonts w:asciiTheme="minorHAnsi" w:hAnsiTheme="minorHAnsi" w:cstheme="minorHAnsi"/>
+          <w:lang w:val="en"/>
+        </w:rPr>
+        <w:t>Lda</w:t>
+      </w:r>
+      <w:proofErr w:type="spellEnd"/>
+      <w:r>
+        <w:rPr>
+          <w:rStyle w:val="q4iawc"/>
+          <w:rFonts w:asciiTheme="minorHAnsi" w:hAnsiTheme="minorHAnsi" w:cstheme="minorHAnsi"/>
+          <w:lang w:val="en"/>
+        </w:rPr>
+        <w:t>. &amp; GAUFF Eng</w:t>
       </w:r>
       <w:r>
         <w:rPr>
@@ -9960,11 +10125,19 @@
         </w:rPr>
         <w:t>F</w:t>
       </w:r>
+      <w:proofErr w:type="spellStart"/>
       <w:r>
         <w:rPr>
           <w:rFonts w:asciiTheme="minorHAnsi" w:eastAsiaTheme="minorHAnsi" w:hAnsiTheme="minorHAnsi" w:cstheme="minorHAnsi"/>
         </w:rPr>
-        <w:t xml:space="preserve">eb 2021-Feb 2022: </w:t>
+        <w:t>eb</w:t>
+      </w:r>
+      <w:proofErr w:type="spellEnd"/>
+      <w:r>
+        <w:rPr>
+          <w:rFonts w:asciiTheme="minorHAnsi" w:eastAsiaTheme="minorHAnsi" w:hAnsiTheme="minorHAnsi" w:cstheme="minorHAnsi"/>
+        </w:rPr>
+        <w:t xml:space="preserve"> 2021-Feb 2022: </w:t>
       </w:r>
       <w:r>
         <w:rPr>
@@ -9972,50 +10145,114 @@
           <w:b/>
           <w:bCs/>
         </w:rPr>
-        <w:t>ESIA for the Construction Project for a Bridge over the Lúrio River between the Districts of Nipepe, Niassa</w:t>
-      </w:r>
+        <w:t xml:space="preserve">ESIA for the Construction Project for a Bridge over the </w:t>
+      </w:r>
+      <w:proofErr w:type="spellStart"/>
       <w:r>
         <w:rPr>
           <w:rFonts w:asciiTheme="minorHAnsi" w:eastAsiaTheme="minorHAnsi" w:hAnsiTheme="minorHAnsi" w:cstheme="minorHAnsi"/>
           <w:b/>
           <w:bCs/>
         </w:rPr>
-        <w:t xml:space="preserve"> Province</w:t>
-      </w:r>
+        <w:t>Lúrio</w:t>
+      </w:r>
+      <w:proofErr w:type="spellEnd"/>
       <w:r>
         <w:rPr>
           <w:rFonts w:asciiTheme="minorHAnsi" w:eastAsiaTheme="minorHAnsi" w:hAnsiTheme="minorHAnsi" w:cstheme="minorHAnsi"/>
           <w:b/>
           <w:bCs/>
         </w:rPr>
-        <w:t>, and Lalaua, Nampula Province.</w:t>
-      </w:r>
-      <w:r>
-        <w:rPr>
-          <w:rFonts w:asciiTheme="minorHAnsi" w:eastAsiaTheme="minorHAnsi" w:hAnsiTheme="minorHAnsi" w:cstheme="minorHAnsi"/>
-        </w:rPr>
-        <w:t xml:space="preserve"> </w:t>
-      </w:r>
-      <w:r>
-        <w:rPr>
-          <w:rFonts w:asciiTheme="minorHAnsi" w:eastAsiaTheme="minorHAnsi" w:hAnsiTheme="minorHAnsi" w:cstheme="minorHAnsi"/>
-        </w:rPr>
-        <w:lastRenderedPageBreak/>
-        <w:t xml:space="preserve">Preparation of Pre-feasibility and Environmental Scoping Report and ToR for ESIA, public consultation meetings and Preparation of ESIA Report, including ESMP. </w:t>
-      </w:r>
+        <w:t xml:space="preserve"> River between the Districts of </w:t>
+      </w:r>
+      <w:proofErr w:type="spellStart"/>
       <w:r>
         <w:rPr>
           <w:rFonts w:asciiTheme="minorHAnsi" w:eastAsiaTheme="minorHAnsi" w:hAnsiTheme="minorHAnsi" w:cstheme="minorHAnsi"/>
           <w:b/>
           <w:bCs/>
         </w:rPr>
+        <w:t>Nipepe</w:t>
+      </w:r>
+      <w:proofErr w:type="spellEnd"/>
+      <w:r>
+        <w:rPr>
+          <w:rFonts w:asciiTheme="minorHAnsi" w:eastAsiaTheme="minorHAnsi" w:hAnsiTheme="minorHAnsi" w:cstheme="minorHAnsi"/>
+          <w:b/>
+          <w:bCs/>
+        </w:rPr>
+        <w:t>, Niassa</w:t>
+      </w:r>
+      <w:r>
+        <w:rPr>
+          <w:rFonts w:asciiTheme="minorHAnsi" w:eastAsiaTheme="minorHAnsi" w:hAnsiTheme="minorHAnsi" w:cstheme="minorHAnsi"/>
+          <w:b/>
+          <w:bCs/>
+        </w:rPr>
+        <w:t xml:space="preserve"> Province</w:t>
+      </w:r>
+      <w:r>
+        <w:rPr>
+          <w:rFonts w:asciiTheme="minorHAnsi" w:eastAsiaTheme="minorHAnsi" w:hAnsiTheme="minorHAnsi" w:cstheme="minorHAnsi"/>
+          <w:b/>
+          <w:bCs/>
+        </w:rPr>
+        <w:t>, and Lalaua, Nampula Province.</w:t>
+      </w:r>
+      <w:r>
+        <w:rPr>
+          <w:rFonts w:asciiTheme="minorHAnsi" w:eastAsiaTheme="minorHAnsi" w:hAnsiTheme="minorHAnsi" w:cstheme="minorHAnsi"/>
+        </w:rPr>
+        <w:t xml:space="preserve"> </w:t>
+      </w:r>
+      <w:r>
+        <w:rPr>
+          <w:rFonts w:asciiTheme="minorHAnsi" w:eastAsiaTheme="minorHAnsi" w:hAnsiTheme="minorHAnsi" w:cstheme="minorHAnsi"/>
+        </w:rPr>
+        <w:lastRenderedPageBreak/>
+        <w:t xml:space="preserve">Preparation of Pre-feasibility and Environmental Scoping Report and </w:t>
+      </w:r>
+      <w:proofErr w:type="spellStart"/>
+      <w:r>
+        <w:rPr>
+          <w:rFonts w:asciiTheme="minorHAnsi" w:eastAsiaTheme="minorHAnsi" w:hAnsiTheme="minorHAnsi" w:cstheme="minorHAnsi"/>
+        </w:rPr>
+        <w:t>ToR</w:t>
+      </w:r>
+      <w:proofErr w:type="spellEnd"/>
+      <w:r>
+        <w:rPr>
+          <w:rFonts w:asciiTheme="minorHAnsi" w:eastAsiaTheme="minorHAnsi" w:hAnsiTheme="minorHAnsi" w:cstheme="minorHAnsi"/>
+        </w:rPr>
+        <w:t xml:space="preserve"> for ESIA, public consultation meetings and Preparation of ESIA Report, including ESMP. </w:t>
+      </w:r>
+      <w:r>
+        <w:rPr>
+          <w:rFonts w:asciiTheme="minorHAnsi" w:eastAsiaTheme="minorHAnsi" w:hAnsiTheme="minorHAnsi" w:cstheme="minorHAnsi"/>
+          <w:b/>
+          <w:bCs/>
+        </w:rPr>
         <w:t>Financed by Chinese Bank</w:t>
       </w:r>
       <w:r>
         <w:rPr>
           <w:rFonts w:asciiTheme="minorHAnsi" w:eastAsiaTheme="minorHAnsi" w:hAnsiTheme="minorHAnsi" w:cstheme="minorHAnsi"/>
         </w:rPr>
-        <w:t>.  Prepared for DH Mining Development Company, Lda. Dong Hafeng Phone +25873444100.</w:t>
+        <w:t xml:space="preserve">.  Prepared for DH Mining Development Company, </w:t>
+      </w:r>
+      <w:proofErr w:type="spellStart"/>
+      <w:r>
+        <w:rPr>
+          <w:rFonts w:asciiTheme="minorHAnsi" w:eastAsiaTheme="minorHAnsi" w:hAnsiTheme="minorHAnsi" w:cstheme="minorHAnsi"/>
+        </w:rPr>
+        <w:t>Lda</w:t>
+      </w:r>
+      <w:proofErr w:type="spellEnd"/>
+      <w:r>
+        <w:rPr>
+          <w:rFonts w:asciiTheme="minorHAnsi" w:eastAsiaTheme="minorHAnsi" w:hAnsiTheme="minorHAnsi" w:cstheme="minorHAnsi"/>
+        </w:rPr>
+        <w:t>. Dong Hafeng Phone +25873444100.</w:t>
       </w:r>
     </w:p>
     <w:p>
@@ -10044,15 +10281,77 @@
           <w:bCs/>
           <w:lang w:val="en"/>
         </w:rPr>
-        <w:t>ESIA for the Reconstruction Cuamba-Insaca and Cuamba-Metarica Roads, Niassa Province</w:t>
-      </w:r>
+        <w:t xml:space="preserve">ESIA for the Reconstruction </w:t>
+      </w:r>
+      <w:proofErr w:type="spellStart"/>
       <w:r>
         <w:rPr>
           <w:rStyle w:val="q4iawc"/>
           <w:rFonts w:asciiTheme="minorHAnsi" w:hAnsiTheme="minorHAnsi" w:cstheme="minorHAnsi"/>
+          <w:b/>
+          <w:bCs/>
           <w:lang w:val="en"/>
         </w:rPr>
-        <w:t xml:space="preserve">. Preparation of the Instruction Process for categorization; Pre-feasibility and Environmental Scoping Report and ToR for the ESIA; Public consultation meetings and Preparation of the final ESIA Report, including ESMP. </w:t>
+        <w:t>Cuamba-Insaca</w:t>
+      </w:r>
+      <w:proofErr w:type="spellEnd"/>
+      <w:r>
+        <w:rPr>
+          <w:rStyle w:val="q4iawc"/>
+          <w:rFonts w:asciiTheme="minorHAnsi" w:hAnsiTheme="minorHAnsi" w:cstheme="minorHAnsi"/>
+          <w:b/>
+          <w:bCs/>
+          <w:lang w:val="en"/>
+        </w:rPr>
+        <w:t xml:space="preserve"> and </w:t>
+      </w:r>
+      <w:proofErr w:type="spellStart"/>
+      <w:r>
+        <w:rPr>
+          <w:rStyle w:val="q4iawc"/>
+          <w:rFonts w:asciiTheme="minorHAnsi" w:hAnsiTheme="minorHAnsi" w:cstheme="minorHAnsi"/>
+          <w:b/>
+          <w:bCs/>
+          <w:lang w:val="en"/>
+        </w:rPr>
+        <w:t>Cuamba-Metarica</w:t>
+      </w:r>
+      <w:proofErr w:type="spellEnd"/>
+      <w:r>
+        <w:rPr>
+          <w:rStyle w:val="q4iawc"/>
+          <w:rFonts w:asciiTheme="minorHAnsi" w:hAnsiTheme="minorHAnsi" w:cstheme="minorHAnsi"/>
+          <w:b/>
+          <w:bCs/>
+          <w:lang w:val="en"/>
+        </w:rPr>
+        <w:t xml:space="preserve"> Roads, Niassa Province</w:t>
+      </w:r>
+      <w:r>
+        <w:rPr>
+          <w:rStyle w:val="q4iawc"/>
+          <w:rFonts w:asciiTheme="minorHAnsi" w:hAnsiTheme="minorHAnsi" w:cstheme="minorHAnsi"/>
+          <w:lang w:val="en"/>
+        </w:rPr>
+        <w:t xml:space="preserve">. Preparation of the Instruction Process for categorization; Pre-feasibility and Environmental Scoping Report and </w:t>
+      </w:r>
+      <w:proofErr w:type="spellStart"/>
+      <w:r>
+        <w:rPr>
+          <w:rStyle w:val="q4iawc"/>
+          <w:rFonts w:asciiTheme="minorHAnsi" w:hAnsiTheme="minorHAnsi" w:cstheme="minorHAnsi"/>
+          <w:lang w:val="en"/>
+        </w:rPr>
+        <w:t>ToR</w:t>
+      </w:r>
+      <w:proofErr w:type="spellEnd"/>
+      <w:r>
+        <w:rPr>
+          <w:rStyle w:val="q4iawc"/>
+          <w:rFonts w:asciiTheme="minorHAnsi" w:hAnsiTheme="minorHAnsi" w:cstheme="minorHAnsi"/>
+          <w:lang w:val="en"/>
+        </w:rPr>
+        <w:t xml:space="preserve"> for the ESIA; Public consultation meetings and Preparation of the final ESIA Report, including ESMP. </w:t>
       </w:r>
       <w:r>
         <w:rPr>
@@ -10466,12 +10765,14 @@
                               </w:rPr>
                               <w:t xml:space="preserve"> </w:t>
                             </w:r>
+                            <w:proofErr w:type="spellStart"/>
                             <w:r>
                               <w:rPr>
                                 <w:sz w:val="14"/>
                               </w:rPr>
                               <w:t>Cidade</w:t>
                             </w:r>
+                            <w:proofErr w:type="spellEnd"/>
                             <w:r>
                               <w:rPr>
                                 <w:spacing w:val="-3"/>
@@ -10845,12 +11146,14 @@
                         </w:rPr>
                         <w:t xml:space="preserve"> </w:t>
                       </w:r>
+                      <w:proofErr w:type="spellStart"/>
                       <w:r>
                         <w:rPr>
                           <w:sz w:val="14"/>
                         </w:rPr>
                         <w:t>Cidade</w:t>
                       </w:r>
+                      <w:proofErr w:type="spellEnd"/>
                       <w:r>
                         <w:rPr>
                           <w:spacing w:val="-3"/>
@@ -10915,7 +11218,51 @@
           <w:bCs/>
           <w:lang w:val="en"/>
         </w:rPr>
-        <w:t xml:space="preserve">Environmental and social Supervision of the Integrated Development Project of Milange Mocuba Corridor - Phase II. Decommissioning of Road Rehabilitation Works Lot 1 </w:t>
+        <w:t xml:space="preserve">Environmental and social Supervision of the Integrated Development Project of </w:t>
+      </w:r>
+      <w:proofErr w:type="spellStart"/>
+      <w:r>
+        <w:rPr>
+          <w:rStyle w:val="q4iawc"/>
+          <w:rFonts w:asciiTheme="minorHAnsi" w:hAnsiTheme="minorHAnsi" w:cstheme="minorHAnsi"/>
+          <w:b/>
+          <w:bCs/>
+          <w:lang w:val="en"/>
+        </w:rPr>
+        <w:t>Milange</w:t>
+      </w:r>
+      <w:proofErr w:type="spellEnd"/>
+      <w:r>
+        <w:rPr>
+          <w:rStyle w:val="q4iawc"/>
+          <w:rFonts w:asciiTheme="minorHAnsi" w:hAnsiTheme="minorHAnsi" w:cstheme="minorHAnsi"/>
+          <w:b/>
+          <w:bCs/>
+          <w:lang w:val="en"/>
+        </w:rPr>
+        <w:t xml:space="preserve"> </w:t>
+      </w:r>
+      <w:proofErr w:type="spellStart"/>
+      <w:r>
+        <w:rPr>
+          <w:rStyle w:val="q4iawc"/>
+          <w:rFonts w:asciiTheme="minorHAnsi" w:hAnsiTheme="minorHAnsi" w:cstheme="minorHAnsi"/>
+          <w:b/>
+          <w:bCs/>
+          <w:lang w:val="en"/>
+        </w:rPr>
+        <w:t>Mocuba</w:t>
+      </w:r>
+      <w:proofErr w:type="spellEnd"/>
+      <w:r>
+        <w:rPr>
+          <w:rStyle w:val="q4iawc"/>
+          <w:rFonts w:asciiTheme="minorHAnsi" w:hAnsiTheme="minorHAnsi" w:cstheme="minorHAnsi"/>
+          <w:b/>
+          <w:bCs/>
+          <w:lang w:val="en"/>
+        </w:rPr>
+        <w:t xml:space="preserve"> Corridor - Phase II. Decommissioning of Road Rehabilitation Works Lot 1 </w:t>
       </w:r>
       <w:r>
         <w:rPr>
@@ -11150,7 +11497,7 @@
       </w:r>
       <w:r>
         <w:rPr>
-          <w:rStyle w:val="TtuloCarter"/>
+          <w:rStyle w:val="TitleChar"/>
           <w:rFonts w:asciiTheme="minorHAnsi" w:hAnsiTheme="minorHAnsi" w:cstheme="minorHAnsi"/>
           <w:b w:val="0"/>
           <w:bCs w:val="0"/>
@@ -11166,16 +11513,9 @@
           <w:bCs/>
           <w:lang w:val="en"/>
         </w:rPr>
-        <w:t>(N11 Muzola - Milange – Geral) and Lot 2 (N11 Geral- Alto Benfica and R653 Mocuba – Lugela), Zambezia Province</w:t>
-      </w:r>
-      <w:r>
-        <w:rPr>
-          <w:rStyle w:val="q4iawc"/>
-          <w:rFonts w:asciiTheme="minorHAnsi" w:hAnsiTheme="minorHAnsi" w:cstheme="minorHAnsi"/>
-          <w:lang w:val="en"/>
-        </w:rPr>
-        <w:t xml:space="preserve">. </w:t>
-      </w:r>
+        <w:t xml:space="preserve">(N11 </w:t>
+      </w:r>
+      <w:proofErr w:type="spellStart"/>
       <w:r>
         <w:rPr>
           <w:rStyle w:val="q4iawc"/>
@@ -11184,6 +11524,101 @@
           <w:bCs/>
           <w:lang w:val="en"/>
         </w:rPr>
+        <w:t>Muzola</w:t>
+      </w:r>
+      <w:proofErr w:type="spellEnd"/>
+      <w:r>
+        <w:rPr>
+          <w:rStyle w:val="q4iawc"/>
+          <w:rFonts w:asciiTheme="minorHAnsi" w:hAnsiTheme="minorHAnsi" w:cstheme="minorHAnsi"/>
+          <w:b/>
+          <w:bCs/>
+          <w:lang w:val="en"/>
+        </w:rPr>
+        <w:t xml:space="preserve"> - </w:t>
+      </w:r>
+      <w:proofErr w:type="spellStart"/>
+      <w:r>
+        <w:rPr>
+          <w:rStyle w:val="q4iawc"/>
+          <w:rFonts w:asciiTheme="minorHAnsi" w:hAnsiTheme="minorHAnsi" w:cstheme="minorHAnsi"/>
+          <w:b/>
+          <w:bCs/>
+          <w:lang w:val="en"/>
+        </w:rPr>
+        <w:t>Milange</w:t>
+      </w:r>
+      <w:proofErr w:type="spellEnd"/>
+      <w:r>
+        <w:rPr>
+          <w:rStyle w:val="q4iawc"/>
+          <w:rFonts w:asciiTheme="minorHAnsi" w:hAnsiTheme="minorHAnsi" w:cstheme="minorHAnsi"/>
+          <w:b/>
+          <w:bCs/>
+          <w:lang w:val="en"/>
+        </w:rPr>
+        <w:t xml:space="preserve"> – Geral) and Lot 2 (N11 Geral- Alto Benfica and R653 </w:t>
+      </w:r>
+      <w:proofErr w:type="spellStart"/>
+      <w:r>
+        <w:rPr>
+          <w:rStyle w:val="q4iawc"/>
+          <w:rFonts w:asciiTheme="minorHAnsi" w:hAnsiTheme="minorHAnsi" w:cstheme="minorHAnsi"/>
+          <w:b/>
+          <w:bCs/>
+          <w:lang w:val="en"/>
+        </w:rPr>
+        <w:t>Mocuba</w:t>
+      </w:r>
+      <w:proofErr w:type="spellEnd"/>
+      <w:r>
+        <w:rPr>
+          <w:rStyle w:val="q4iawc"/>
+          <w:rFonts w:asciiTheme="minorHAnsi" w:hAnsiTheme="minorHAnsi" w:cstheme="minorHAnsi"/>
+          <w:b/>
+          <w:bCs/>
+          <w:lang w:val="en"/>
+        </w:rPr>
+        <w:t xml:space="preserve"> – </w:t>
+      </w:r>
+      <w:proofErr w:type="spellStart"/>
+      <w:r>
+        <w:rPr>
+          <w:rStyle w:val="q4iawc"/>
+          <w:rFonts w:asciiTheme="minorHAnsi" w:hAnsiTheme="minorHAnsi" w:cstheme="minorHAnsi"/>
+          <w:b/>
+          <w:bCs/>
+          <w:lang w:val="en"/>
+        </w:rPr>
+        <w:t>Lugela</w:t>
+      </w:r>
+      <w:proofErr w:type="spellEnd"/>
+      <w:r>
+        <w:rPr>
+          <w:rStyle w:val="q4iawc"/>
+          <w:rFonts w:asciiTheme="minorHAnsi" w:hAnsiTheme="minorHAnsi" w:cstheme="minorHAnsi"/>
+          <w:b/>
+          <w:bCs/>
+          <w:lang w:val="en"/>
+        </w:rPr>
+        <w:t>), Zambezia Province</w:t>
+      </w:r>
+      <w:r>
+        <w:rPr>
+          <w:rStyle w:val="q4iawc"/>
+          <w:rFonts w:asciiTheme="minorHAnsi" w:hAnsiTheme="minorHAnsi" w:cstheme="minorHAnsi"/>
+          <w:lang w:val="en"/>
+        </w:rPr>
+        <w:t xml:space="preserve">. </w:t>
+      </w:r>
+      <w:r>
+        <w:rPr>
+          <w:rStyle w:val="q4iawc"/>
+          <w:rFonts w:asciiTheme="minorHAnsi" w:hAnsiTheme="minorHAnsi" w:cstheme="minorHAnsi"/>
+          <w:b/>
+          <w:bCs/>
+          <w:lang w:val="en"/>
+        </w:rPr>
         <w:t>Financed by EU</w:t>
       </w:r>
       <w:r>
@@ -11210,7 +11645,77 @@
         <w:rPr>
           <w:rFonts w:asciiTheme="minorHAnsi" w:eastAsiaTheme="minorHAnsi" w:hAnsiTheme="minorHAnsi" w:cstheme="minorHAnsi"/>
         </w:rPr>
-        <w:t xml:space="preserve"> environmental status of closure, specifically at the Namanjavira, Milange and Lugela Campsites; Raivoso and Tengua,</w:t>
+        <w:t xml:space="preserve"> environmental status of closure, specifically at the </w:t>
+      </w:r>
+      <w:proofErr w:type="spellStart"/>
+      <w:r>
+        <w:rPr>
+          <w:rFonts w:asciiTheme="minorHAnsi" w:eastAsiaTheme="minorHAnsi" w:hAnsiTheme="minorHAnsi" w:cstheme="minorHAnsi"/>
+        </w:rPr>
+        <w:t>Namanjavira</w:t>
+      </w:r>
+      <w:proofErr w:type="spellEnd"/>
+      <w:r>
+        <w:rPr>
+          <w:rFonts w:asciiTheme="minorHAnsi" w:eastAsiaTheme="minorHAnsi" w:hAnsiTheme="minorHAnsi" w:cstheme="minorHAnsi"/>
+        </w:rPr>
+        <w:t xml:space="preserve">, </w:t>
+      </w:r>
+      <w:proofErr w:type="spellStart"/>
+      <w:r>
+        <w:rPr>
+          <w:rFonts w:asciiTheme="minorHAnsi" w:eastAsiaTheme="minorHAnsi" w:hAnsiTheme="minorHAnsi" w:cstheme="minorHAnsi"/>
+        </w:rPr>
+        <w:t>Milange</w:t>
+      </w:r>
+      <w:proofErr w:type="spellEnd"/>
+      <w:r>
+        <w:rPr>
+          <w:rFonts w:asciiTheme="minorHAnsi" w:eastAsiaTheme="minorHAnsi" w:hAnsiTheme="minorHAnsi" w:cstheme="minorHAnsi"/>
+        </w:rPr>
+        <w:t xml:space="preserve"> and </w:t>
+      </w:r>
+      <w:proofErr w:type="spellStart"/>
+      <w:r>
+        <w:rPr>
+          <w:rFonts w:asciiTheme="minorHAnsi" w:eastAsiaTheme="minorHAnsi" w:hAnsiTheme="minorHAnsi" w:cstheme="minorHAnsi"/>
+        </w:rPr>
+        <w:t>Lugela</w:t>
+      </w:r>
+      <w:proofErr w:type="spellEnd"/>
+      <w:r>
+        <w:rPr>
+          <w:rFonts w:asciiTheme="minorHAnsi" w:eastAsiaTheme="minorHAnsi" w:hAnsiTheme="minorHAnsi" w:cstheme="minorHAnsi"/>
+        </w:rPr>
+        <w:t xml:space="preserve"> Campsites; </w:t>
+      </w:r>
+      <w:proofErr w:type="spellStart"/>
+      <w:r>
+        <w:rPr>
+          <w:rFonts w:asciiTheme="minorHAnsi" w:eastAsiaTheme="minorHAnsi" w:hAnsiTheme="minorHAnsi" w:cstheme="minorHAnsi"/>
+        </w:rPr>
+        <w:t>Raivoso</w:t>
+      </w:r>
+      <w:proofErr w:type="spellEnd"/>
+      <w:r>
+        <w:rPr>
+          <w:rFonts w:asciiTheme="minorHAnsi" w:eastAsiaTheme="minorHAnsi" w:hAnsiTheme="minorHAnsi" w:cstheme="minorHAnsi"/>
+        </w:rPr>
+        <w:t xml:space="preserve"> and </w:t>
+      </w:r>
+      <w:proofErr w:type="spellStart"/>
+      <w:r>
+        <w:rPr>
+          <w:rFonts w:asciiTheme="minorHAnsi" w:eastAsiaTheme="minorHAnsi" w:hAnsiTheme="minorHAnsi" w:cstheme="minorHAnsi"/>
+        </w:rPr>
+        <w:t>Tengua</w:t>
+      </w:r>
+      <w:proofErr w:type="spellEnd"/>
+      <w:r>
+        <w:rPr>
+          <w:rFonts w:asciiTheme="minorHAnsi" w:eastAsiaTheme="minorHAnsi" w:hAnsiTheme="minorHAnsi" w:cstheme="minorHAnsi"/>
+        </w:rPr>
+        <w:t>,</w:t>
       </w:r>
       <w:r>
         <w:rPr>
@@ -11295,7 +11800,79 @@
           <w:b/>
           <w:bCs/>
         </w:rPr>
-        <w:t>Environmental Simplified Study (ESS). Project of the 8 bridges on the N380 in the Muidumbe, Mocimba da Praia, Macomia and Ancuabe Districts, Cabo Delgado Province.</w:t>
+        <w:t xml:space="preserve">Environmental Simplified Study (ESS). Project of the 8 bridges on the N380 in the </w:t>
+      </w:r>
+      <w:proofErr w:type="spellStart"/>
+      <w:r>
+        <w:rPr>
+          <w:rFonts w:asciiTheme="minorHAnsi" w:hAnsiTheme="minorHAnsi" w:cstheme="minorHAnsi"/>
+          <w:b/>
+          <w:bCs/>
+        </w:rPr>
+        <w:t>Muidumbe</w:t>
+      </w:r>
+      <w:proofErr w:type="spellEnd"/>
+      <w:r>
+        <w:rPr>
+          <w:rFonts w:asciiTheme="minorHAnsi" w:hAnsiTheme="minorHAnsi" w:cstheme="minorHAnsi"/>
+          <w:b/>
+          <w:bCs/>
+        </w:rPr>
+        <w:t xml:space="preserve">, </w:t>
+      </w:r>
+      <w:proofErr w:type="spellStart"/>
+      <w:r>
+        <w:rPr>
+          <w:rFonts w:asciiTheme="minorHAnsi" w:hAnsiTheme="minorHAnsi" w:cstheme="minorHAnsi"/>
+          <w:b/>
+          <w:bCs/>
+        </w:rPr>
+        <w:t>Mocimba</w:t>
+      </w:r>
+      <w:proofErr w:type="spellEnd"/>
+      <w:r>
+        <w:rPr>
+          <w:rFonts w:asciiTheme="minorHAnsi" w:hAnsiTheme="minorHAnsi" w:cstheme="minorHAnsi"/>
+          <w:b/>
+          <w:bCs/>
+        </w:rPr>
+        <w:t xml:space="preserve"> da Praia, </w:t>
+      </w:r>
+      <w:proofErr w:type="spellStart"/>
+      <w:r>
+        <w:rPr>
+          <w:rFonts w:asciiTheme="minorHAnsi" w:hAnsiTheme="minorHAnsi" w:cstheme="minorHAnsi"/>
+          <w:b/>
+          <w:bCs/>
+        </w:rPr>
+        <w:t>Macomia</w:t>
+      </w:r>
+      <w:proofErr w:type="spellEnd"/>
+      <w:r>
+        <w:rPr>
+          <w:rFonts w:asciiTheme="minorHAnsi" w:hAnsiTheme="minorHAnsi" w:cstheme="minorHAnsi"/>
+          <w:b/>
+          <w:bCs/>
+        </w:rPr>
+        <w:t xml:space="preserve"> and </w:t>
+      </w:r>
+      <w:proofErr w:type="spellStart"/>
+      <w:r>
+        <w:rPr>
+          <w:rFonts w:asciiTheme="minorHAnsi" w:hAnsiTheme="minorHAnsi" w:cstheme="minorHAnsi"/>
+          <w:b/>
+          <w:bCs/>
+        </w:rPr>
+        <w:t>Ancuabe</w:t>
+      </w:r>
+      <w:proofErr w:type="spellEnd"/>
+      <w:r>
+        <w:rPr>
+          <w:rFonts w:asciiTheme="minorHAnsi" w:hAnsiTheme="minorHAnsi" w:cstheme="minorHAnsi"/>
+          <w:b/>
+          <w:bCs/>
+        </w:rPr>
+        <w:t xml:space="preserve"> Districts, Cabo Delgado Province.</w:t>
       </w:r>
       <w:r>
         <w:rPr>
@@ -11307,7 +11884,21 @@
         <w:rPr>
           <w:rFonts w:asciiTheme="minorHAnsi" w:eastAsiaTheme="minorHAnsi" w:hAnsiTheme="minorHAnsi" w:cstheme="minorHAnsi"/>
         </w:rPr>
-        <w:t xml:space="preserve">reparation of the scope of the study; Preparation of ToR for the ESS; Public consultation and Preparation of the ESS report final, including EMP. </w:t>
+        <w:t xml:space="preserve">reparation of the scope of the study; Preparation of </w:t>
+      </w:r>
+      <w:proofErr w:type="spellStart"/>
+      <w:r>
+        <w:rPr>
+          <w:rFonts w:asciiTheme="minorHAnsi" w:eastAsiaTheme="minorHAnsi" w:hAnsiTheme="minorHAnsi" w:cstheme="minorHAnsi"/>
+        </w:rPr>
+        <w:t>ToR</w:t>
+      </w:r>
+      <w:proofErr w:type="spellEnd"/>
+      <w:r>
+        <w:rPr>
+          <w:rFonts w:asciiTheme="minorHAnsi" w:eastAsiaTheme="minorHAnsi" w:hAnsiTheme="minorHAnsi" w:cstheme="minorHAnsi"/>
+        </w:rPr>
+        <w:t xml:space="preserve"> for the ESS; Public consultation and Preparation of the ESS report final, including EMP. </w:t>
       </w:r>
       <w:r>
         <w:rPr>
@@ -11348,7 +11939,7 @@
       <w:hyperlink r:id="rId14" w:tgtFrame="_blank" w:history="1">
         <w:r>
           <w:rPr>
-            <w:rStyle w:val="Hiperligao"/>
+            <w:rStyle w:val="Hyperlink"/>
             <w:rFonts w:asciiTheme="minorHAnsi" w:hAnsiTheme="minorHAnsi" w:cstheme="minorHAnsi"/>
             <w:color w:val="auto"/>
             <w:u w:val="none"/>
@@ -11405,7 +11996,7 @@
         <w:spacing w:before="240" w:after="120"/>
         <w:ind w:left="1080"/>
         <w:rPr>
-          <w:rStyle w:val="Hiperligao"/>
+          <w:rStyle w:val="Hyperlink"/>
           <w:rFonts w:asciiTheme="minorHAnsi" w:eastAsia="Batang" w:hAnsiTheme="minorHAnsi" w:cstheme="minorHAnsi"/>
           <w:color w:val="auto"/>
           <w:u w:val="none"/>
@@ -11478,7 +12069,7 @@
       <w:hyperlink r:id="rId15" w:history="1">
         <w:r>
           <w:rPr>
-            <w:rStyle w:val="Hiperligao"/>
+            <w:rStyle w:val="Hyperlink"/>
             <w:rFonts w:asciiTheme="minorHAnsi" w:eastAsia="Batang" w:hAnsiTheme="minorHAnsi" w:cstheme="minorHAnsi"/>
             <w:color w:val="auto"/>
             <w:u w:val="none"/>
@@ -11502,7 +12093,61 @@
           <w:b/>
           <w:bCs/>
         </w:rPr>
-        <w:t xml:space="preserve">2014-2016: Consultancy Services for Construction and Rehabilitation Supervision of Roads N103 and R657, between Magige, Etatara and Cuamba, Zambezia and Niassa Province. </w:t>
+        <w:t xml:space="preserve">2014-2016: Consultancy Services for Construction and Rehabilitation Supervision of Roads N103 and R657, between </w:t>
+      </w:r>
+      <w:proofErr w:type="spellStart"/>
+      <w:r>
+        <w:rPr>
+          <w:rFonts w:asciiTheme="minorHAnsi" w:eastAsiaTheme="minorHAnsi" w:hAnsiTheme="minorHAnsi" w:cstheme="minorHAnsi"/>
+          <w:b/>
+          <w:bCs/>
+        </w:rPr>
+        <w:t>Magige</w:t>
+      </w:r>
+      <w:proofErr w:type="spellEnd"/>
+      <w:r>
+        <w:rPr>
+          <w:rFonts w:asciiTheme="minorHAnsi" w:eastAsiaTheme="minorHAnsi" w:hAnsiTheme="minorHAnsi" w:cstheme="minorHAnsi"/>
+          <w:b/>
+          <w:bCs/>
+        </w:rPr>
+        <w:t xml:space="preserve">, </w:t>
+      </w:r>
+      <w:proofErr w:type="spellStart"/>
+      <w:r>
+        <w:rPr>
+          <w:rFonts w:asciiTheme="minorHAnsi" w:eastAsiaTheme="minorHAnsi" w:hAnsiTheme="minorHAnsi" w:cstheme="minorHAnsi"/>
+          <w:b/>
+          <w:bCs/>
+        </w:rPr>
+        <w:t>Etatara</w:t>
+      </w:r>
+      <w:proofErr w:type="spellEnd"/>
+      <w:r>
+        <w:rPr>
+          <w:rFonts w:asciiTheme="minorHAnsi" w:eastAsiaTheme="minorHAnsi" w:hAnsiTheme="minorHAnsi" w:cstheme="minorHAnsi"/>
+          <w:b/>
+          <w:bCs/>
+        </w:rPr>
+        <w:t xml:space="preserve"> and </w:t>
+      </w:r>
+      <w:proofErr w:type="spellStart"/>
+      <w:r>
+        <w:rPr>
+          <w:rFonts w:asciiTheme="minorHAnsi" w:eastAsiaTheme="minorHAnsi" w:hAnsiTheme="minorHAnsi" w:cstheme="minorHAnsi"/>
+          <w:b/>
+          <w:bCs/>
+        </w:rPr>
+        <w:t>Cuamba</w:t>
+      </w:r>
+      <w:proofErr w:type="spellEnd"/>
+      <w:r>
+        <w:rPr>
+          <w:rFonts w:asciiTheme="minorHAnsi" w:eastAsiaTheme="minorHAnsi" w:hAnsiTheme="minorHAnsi" w:cstheme="minorHAnsi"/>
+          <w:b/>
+          <w:bCs/>
+        </w:rPr>
+        <w:t xml:space="preserve">, Zambezia and Niassa Province. </w:t>
       </w:r>
       <w:r>
         <w:rPr>
@@ -11542,18 +12187,31 @@
         </w:rPr>
         <w:t>Consulmar Mocambique, Projectistas e Consultores, Lda., Maputo Carlos Amado, +25821320480</w:t>
       </w:r>
-      <w:hyperlink r:id="rId16" w:history="1">
-        <w:r>
-          <w:rPr>
-            <w:rStyle w:val="Hiperligao"/>
-            <w:rFonts w:asciiTheme="minorHAnsi" w:eastAsia="Batang" w:hAnsiTheme="minorHAnsi" w:cstheme="minorHAnsi"/>
-            <w:color w:val="auto"/>
-            <w:u w:val="none"/>
-            <w:lang w:val="pt-PT"/>
-          </w:rPr>
-          <w:t>carlosamado.consulamar@gmail.com</w:t>
-        </w:r>
-      </w:hyperlink>
+      <w:r>
+        <w:fldChar w:fldCharType="begin"/>
+      </w:r>
+      <w:r>
+        <w:rPr>
+          <w:lang w:val="pt-BR"/>
+        </w:rPr>
+        <w:instrText>HYPERLINK "mailto:carlosamado.consulamar@gmail.com"</w:instrText>
+      </w:r>
+      <w:r>
+        <w:fldChar w:fldCharType="separate"/>
+      </w:r>
+      <w:r>
+        <w:rPr>
+          <w:rStyle w:val="Hyperlink"/>
+          <w:rFonts w:asciiTheme="minorHAnsi" w:eastAsia="Batang" w:hAnsiTheme="minorHAnsi" w:cstheme="minorHAnsi"/>
+          <w:color w:val="auto"/>
+          <w:u w:val="none"/>
+          <w:lang w:val="pt-PT"/>
+        </w:rPr>
+        <w:t>carlosamado.consulamar@gmail.com</w:t>
+      </w:r>
+      <w:r>
+        <w:fldChar w:fldCharType="end"/>
+      </w:r>
     </w:p>
     <w:p>
       <w:pPr>
@@ -11586,20 +12244,70 @@
           <w:b/>
           <w:bCs/>
         </w:rPr>
-        <w:t>Environmental Simplified Study (ESS). Rehabilitation of Road N1 between Rio Save and Muxungue Project, Sofala Province</w:t>
-      </w:r>
-      <w:r>
-        <w:rPr>
-          <w:rFonts w:asciiTheme="minorHAnsi" w:eastAsiaTheme="minorHAnsi" w:hAnsiTheme="minorHAnsi" w:cstheme="minorHAnsi"/>
-        </w:rPr>
-        <w:t xml:space="preserve">. Preparation of the ToR to ESS, as well as public consultation, and Preparation of the final EAS Report, including EMP. </w:t>
-      </w:r>
+        <w:t xml:space="preserve">Environmental Simplified Study (ESS). Rehabilitation of Road N1 between Rio Save and </w:t>
+      </w:r>
+      <w:proofErr w:type="spellStart"/>
       <w:r>
         <w:rPr>
           <w:rFonts w:asciiTheme="minorHAnsi" w:eastAsiaTheme="minorHAnsi" w:hAnsiTheme="minorHAnsi" w:cstheme="minorHAnsi"/>
           <w:b/>
           <w:bCs/>
         </w:rPr>
+        <w:t>Muxungue</w:t>
+      </w:r>
+      <w:proofErr w:type="spellEnd"/>
+      <w:r>
+        <w:rPr>
+          <w:rFonts w:asciiTheme="minorHAnsi" w:eastAsiaTheme="minorHAnsi" w:hAnsiTheme="minorHAnsi" w:cstheme="minorHAnsi"/>
+          <w:b/>
+          <w:bCs/>
+        </w:rPr>
+        <w:t xml:space="preserve"> Project, </w:t>
+      </w:r>
+      <w:proofErr w:type="spellStart"/>
+      <w:r>
+        <w:rPr>
+          <w:rFonts w:asciiTheme="minorHAnsi" w:eastAsiaTheme="minorHAnsi" w:hAnsiTheme="minorHAnsi" w:cstheme="minorHAnsi"/>
+          <w:b/>
+          <w:bCs/>
+        </w:rPr>
+        <w:t>Sofala</w:t>
+      </w:r>
+      <w:proofErr w:type="spellEnd"/>
+      <w:r>
+        <w:rPr>
+          <w:rFonts w:asciiTheme="minorHAnsi" w:eastAsiaTheme="minorHAnsi" w:hAnsiTheme="minorHAnsi" w:cstheme="minorHAnsi"/>
+          <w:b/>
+          <w:bCs/>
+        </w:rPr>
+        <w:t xml:space="preserve"> Province</w:t>
+      </w:r>
+      <w:r>
+        <w:rPr>
+          <w:rFonts w:asciiTheme="minorHAnsi" w:eastAsiaTheme="minorHAnsi" w:hAnsiTheme="minorHAnsi" w:cstheme="minorHAnsi"/>
+        </w:rPr>
+        <w:t xml:space="preserve">. Preparation of the </w:t>
+      </w:r>
+      <w:proofErr w:type="spellStart"/>
+      <w:r>
+        <w:rPr>
+          <w:rFonts w:asciiTheme="minorHAnsi" w:eastAsiaTheme="minorHAnsi" w:hAnsiTheme="minorHAnsi" w:cstheme="minorHAnsi"/>
+        </w:rPr>
+        <w:t>ToR</w:t>
+      </w:r>
+      <w:proofErr w:type="spellEnd"/>
+      <w:r>
+        <w:rPr>
+          <w:rFonts w:asciiTheme="minorHAnsi" w:eastAsiaTheme="minorHAnsi" w:hAnsiTheme="minorHAnsi" w:cstheme="minorHAnsi"/>
+        </w:rPr>
+        <w:t xml:space="preserve"> to ESS, as well as public consultation, and Preparation of the final EAS Report, including EMP. </w:t>
+      </w:r>
+      <w:r>
+        <w:rPr>
+          <w:rFonts w:asciiTheme="minorHAnsi" w:eastAsiaTheme="minorHAnsi" w:hAnsiTheme="minorHAnsi" w:cstheme="minorHAnsi"/>
+          <w:b/>
+          <w:bCs/>
+        </w:rPr>
         <w:t>Financed by EU</w:t>
       </w:r>
       <w:r>
@@ -11608,7 +12316,7 @@
         </w:rPr>
         <w:t>. Prepared for SAI Consulting Engineers Pvt. Ltd. India. Abhik Bhattacharjee Phone: +91-909994174</w:t>
       </w:r>
-      <w:hyperlink r:id="rId17" w:history="1">
+      <w:hyperlink r:id="rId16" w:history="1">
         <w:r>
           <w:rPr>
             <w:rFonts w:asciiTheme="minorHAnsi" w:eastAsiaTheme="minorHAnsi" w:hAnsiTheme="minorHAnsi" w:cstheme="minorHAnsi"/>
@@ -12005,12 +12713,14 @@
                               </w:rPr>
                               <w:t xml:space="preserve"> </w:t>
                             </w:r>
+                            <w:proofErr w:type="spellStart"/>
                             <w:r>
                               <w:rPr>
                                 <w:sz w:val="14"/>
                               </w:rPr>
                               <w:t>Cidade</w:t>
                             </w:r>
+                            <w:proofErr w:type="spellEnd"/>
                             <w:r>
                               <w:rPr>
                                 <w:spacing w:val="-3"/>
@@ -12384,12 +13094,14 @@
                         </w:rPr>
                         <w:t xml:space="preserve"> </w:t>
                       </w:r>
+                      <w:proofErr w:type="spellStart"/>
                       <w:r>
                         <w:rPr>
                           <w:sz w:val="14"/>
                         </w:rPr>
                         <w:t>Cidade</w:t>
                       </w:r>
+                      <w:proofErr w:type="spellEnd"/>
                       <w:r>
                         <w:rPr>
                           <w:spacing w:val="-3"/>
@@ -12707,9 +13419,23 @@
         <w:rPr>
           <w:rFonts w:asciiTheme="minorHAnsi" w:hAnsiTheme="minorHAnsi" w:cstheme="minorHAnsi"/>
         </w:rPr>
-        <w:t xml:space="preserve"> by SMEC International Pty, Ltd, Stayford Kampini Phiri. Phone: +260211267980/1, Lusaka, Zambia </w:t>
-      </w:r>
-      <w:hyperlink r:id="rId18" w:history="1">
+        <w:t xml:space="preserve"> by SMEC International Pty, Ltd, </w:t>
+      </w:r>
+      <w:proofErr w:type="spellStart"/>
+      <w:r>
+        <w:rPr>
+          <w:rFonts w:asciiTheme="minorHAnsi" w:hAnsiTheme="minorHAnsi" w:cstheme="minorHAnsi"/>
+        </w:rPr>
+        <w:t>Stayford</w:t>
+      </w:r>
+      <w:proofErr w:type="spellEnd"/>
+      <w:r>
+        <w:rPr>
+          <w:rFonts w:asciiTheme="minorHAnsi" w:hAnsiTheme="minorHAnsi" w:cstheme="minorHAnsi"/>
+        </w:rPr>
+        <w:t xml:space="preserve"> Kampini Phiri. Phone: +260211267980/1, Lusaka, Zambia </w:t>
+      </w:r>
+      <w:hyperlink r:id="rId17" w:history="1">
         <w:r>
           <w:rPr>
             <w:rFonts w:asciiTheme="minorHAnsi" w:hAnsiTheme="minorHAnsi" w:cstheme="minorHAnsi"/>
@@ -12723,7 +13449,7 @@
         </w:rPr>
         <w:t xml:space="preserve"> and Fred Madeira. +258823289330. </w:t>
       </w:r>
-      <w:hyperlink r:id="rId19" w:history="1">
+      <w:hyperlink r:id="rId18" w:history="1">
         <w:r>
           <w:rPr>
             <w:rFonts w:asciiTheme="minorHAnsi" w:hAnsiTheme="minorHAnsi" w:cstheme="minorHAnsi"/>
@@ -12750,20 +13476,56 @@
           <w:b/>
           <w:bCs/>
         </w:rPr>
-        <w:t>2015-2015: Integrated Development of Milange Mocuba Corridor – Phase II, Lot 2 (Geral - Alto Benfica).</w:t>
-      </w:r>
-      <w:r>
-        <w:rPr>
-          <w:rFonts w:asciiTheme="minorHAnsi" w:eastAsiaTheme="minorHAnsi" w:hAnsiTheme="minorHAnsi" w:cstheme="minorHAnsi"/>
-        </w:rPr>
-        <w:t xml:space="preserve"> Monitoring for implementation of EHS impact mitigation measures as defined in ESIA and ESMP as part of Supervision Team.  Assistance by the mobilization and continuous Supervision of Construction Works, including claim Management. Continuous Supervision of EMP and H&amp;S. Monitoring the implementation of environmental impacts. </w:t>
-      </w:r>
+        <w:t xml:space="preserve">2015-2015: Integrated Development of </w:t>
+      </w:r>
+      <w:proofErr w:type="spellStart"/>
       <w:r>
         <w:rPr>
           <w:rFonts w:asciiTheme="minorHAnsi" w:eastAsiaTheme="minorHAnsi" w:hAnsiTheme="minorHAnsi" w:cstheme="minorHAnsi"/>
           <w:b/>
           <w:bCs/>
         </w:rPr>
+        <w:t>Milange</w:t>
+      </w:r>
+      <w:proofErr w:type="spellEnd"/>
+      <w:r>
+        <w:rPr>
+          <w:rFonts w:asciiTheme="minorHAnsi" w:eastAsiaTheme="minorHAnsi" w:hAnsiTheme="minorHAnsi" w:cstheme="minorHAnsi"/>
+          <w:b/>
+          <w:bCs/>
+        </w:rPr>
+        <w:t xml:space="preserve"> </w:t>
+      </w:r>
+      <w:proofErr w:type="spellStart"/>
+      <w:r>
+        <w:rPr>
+          <w:rFonts w:asciiTheme="minorHAnsi" w:eastAsiaTheme="minorHAnsi" w:hAnsiTheme="minorHAnsi" w:cstheme="minorHAnsi"/>
+          <w:b/>
+          <w:bCs/>
+        </w:rPr>
+        <w:t>Mocuba</w:t>
+      </w:r>
+      <w:proofErr w:type="spellEnd"/>
+      <w:r>
+        <w:rPr>
+          <w:rFonts w:asciiTheme="minorHAnsi" w:eastAsiaTheme="minorHAnsi" w:hAnsiTheme="minorHAnsi" w:cstheme="minorHAnsi"/>
+          <w:b/>
+          <w:bCs/>
+        </w:rPr>
+        <w:t xml:space="preserve"> Corridor – Phase II, Lot 2 (Geral - Alto Benfica).</w:t>
+      </w:r>
+      <w:r>
+        <w:rPr>
+          <w:rFonts w:asciiTheme="minorHAnsi" w:eastAsiaTheme="minorHAnsi" w:hAnsiTheme="minorHAnsi" w:cstheme="minorHAnsi"/>
+        </w:rPr>
+        <w:t xml:space="preserve"> Monitoring for implementation of EHS impact mitigation measures as defined in ESIA and ESMP as part of Supervision Team.  Assistance by the mobilization and continuous Supervision of Construction Works, including claim Management. Continuous Supervision of EMP and H&amp;S. Monitoring the implementation of environmental impacts. </w:t>
+      </w:r>
+      <w:r>
+        <w:rPr>
+          <w:rFonts w:asciiTheme="minorHAnsi" w:eastAsiaTheme="minorHAnsi" w:hAnsiTheme="minorHAnsi" w:cstheme="minorHAnsi"/>
+          <w:b/>
+          <w:bCs/>
+        </w:rPr>
         <w:t>Financed by EU</w:t>
       </w:r>
       <w:r>
@@ -12772,7 +13534,7 @@
         </w:rPr>
         <w:t xml:space="preserve">. Contracted by Nicholas O'Dwyer Ltd Dublin, Irland. Michel Davitt. </w:t>
       </w:r>
-      <w:hyperlink r:id="rId20" w:history="1">
+      <w:hyperlink r:id="rId19" w:history="1">
         <w:r>
           <w:rPr>
             <w:rFonts w:asciiTheme="minorHAnsi" w:eastAsiaTheme="minorHAnsi" w:hAnsiTheme="minorHAnsi" w:cstheme="minorHAnsi"/>
@@ -12800,20 +13562,88 @@
           <w:b/>
           <w:bCs/>
         </w:rPr>
-        <w:t>Environmental Impact Study. Building of the new Bridge Project over Incomati River close Magude Village, Maputo Ptovince.</w:t>
-      </w:r>
-      <w:r>
-        <w:rPr>
-          <w:rFonts w:asciiTheme="minorHAnsi" w:eastAsiaTheme="minorHAnsi" w:hAnsiTheme="minorHAnsi" w:cstheme="minorHAnsi"/>
-        </w:rPr>
-        <w:t xml:space="preserve"> Conducted the Pre-feasibility and Environmental Scoping Report and ToR for Environmental and Social Impact Study (ESIA), public consultation meetings and Preparation of ESIA, including ESMP. </w:t>
-      </w:r>
+        <w:t xml:space="preserve">Environmental Impact Study. Building of the new Bridge Project over </w:t>
+      </w:r>
+      <w:proofErr w:type="spellStart"/>
       <w:r>
         <w:rPr>
           <w:rFonts w:asciiTheme="minorHAnsi" w:eastAsiaTheme="minorHAnsi" w:hAnsiTheme="minorHAnsi" w:cstheme="minorHAnsi"/>
           <w:b/>
           <w:bCs/>
         </w:rPr>
+        <w:t>Incomati</w:t>
+      </w:r>
+      <w:proofErr w:type="spellEnd"/>
+      <w:r>
+        <w:rPr>
+          <w:rFonts w:asciiTheme="minorHAnsi" w:eastAsiaTheme="minorHAnsi" w:hAnsiTheme="minorHAnsi" w:cstheme="minorHAnsi"/>
+          <w:b/>
+          <w:bCs/>
+        </w:rPr>
+        <w:t xml:space="preserve"> River close </w:t>
+      </w:r>
+      <w:proofErr w:type="spellStart"/>
+      <w:r>
+        <w:rPr>
+          <w:rFonts w:asciiTheme="minorHAnsi" w:eastAsiaTheme="minorHAnsi" w:hAnsiTheme="minorHAnsi" w:cstheme="minorHAnsi"/>
+          <w:b/>
+          <w:bCs/>
+        </w:rPr>
+        <w:t>Magude</w:t>
+      </w:r>
+      <w:proofErr w:type="spellEnd"/>
+      <w:r>
+        <w:rPr>
+          <w:rFonts w:asciiTheme="minorHAnsi" w:eastAsiaTheme="minorHAnsi" w:hAnsiTheme="minorHAnsi" w:cstheme="minorHAnsi"/>
+          <w:b/>
+          <w:bCs/>
+        </w:rPr>
+        <w:t xml:space="preserve"> Village, Maputo </w:t>
+      </w:r>
+      <w:proofErr w:type="spellStart"/>
+      <w:r>
+        <w:rPr>
+          <w:rFonts w:asciiTheme="minorHAnsi" w:eastAsiaTheme="minorHAnsi" w:hAnsiTheme="minorHAnsi" w:cstheme="minorHAnsi"/>
+          <w:b/>
+          <w:bCs/>
+        </w:rPr>
+        <w:t>Ptovince</w:t>
+      </w:r>
+      <w:proofErr w:type="spellEnd"/>
+      <w:r>
+        <w:rPr>
+          <w:rFonts w:asciiTheme="minorHAnsi" w:eastAsiaTheme="minorHAnsi" w:hAnsiTheme="minorHAnsi" w:cstheme="minorHAnsi"/>
+          <w:b/>
+          <w:bCs/>
+        </w:rPr>
+        <w:t>.</w:t>
+      </w:r>
+      <w:r>
+        <w:rPr>
+          <w:rFonts w:asciiTheme="minorHAnsi" w:eastAsiaTheme="minorHAnsi" w:hAnsiTheme="minorHAnsi" w:cstheme="minorHAnsi"/>
+        </w:rPr>
+        <w:t xml:space="preserve"> Conducted the Pre-feasibility and Environmental Scoping Report and </w:t>
+      </w:r>
+      <w:proofErr w:type="spellStart"/>
+      <w:r>
+        <w:rPr>
+          <w:rFonts w:asciiTheme="minorHAnsi" w:eastAsiaTheme="minorHAnsi" w:hAnsiTheme="minorHAnsi" w:cstheme="minorHAnsi"/>
+        </w:rPr>
+        <w:t>ToR</w:t>
+      </w:r>
+      <w:proofErr w:type="spellEnd"/>
+      <w:r>
+        <w:rPr>
+          <w:rFonts w:asciiTheme="minorHAnsi" w:eastAsiaTheme="minorHAnsi" w:hAnsiTheme="minorHAnsi" w:cstheme="minorHAnsi"/>
+        </w:rPr>
+        <w:t xml:space="preserve"> for Environmental and Social Impact Study (ESIA), public consultation meetings and Preparation of ESIA, including ESMP. </w:t>
+      </w:r>
+      <w:r>
+        <w:rPr>
+          <w:rFonts w:asciiTheme="minorHAnsi" w:eastAsiaTheme="minorHAnsi" w:hAnsiTheme="minorHAnsi" w:cstheme="minorHAnsi"/>
+          <w:b/>
+          <w:bCs/>
+        </w:rPr>
         <w:t>Financed by WB</w:t>
       </w:r>
       <w:r>
@@ -12822,7 +13652,7 @@
         </w:rPr>
         <w:t xml:space="preserve">. Prepared to SAI Consulting Engineers Pvt. Ltd, Abhik Bhattacharjee. Phone: +91-909994174, India. </w:t>
       </w:r>
-      <w:hyperlink r:id="rId21" w:history="1">
+      <w:hyperlink r:id="rId20" w:history="1">
         <w:r>
           <w:rPr>
             <w:rFonts w:asciiTheme="minorHAnsi" w:eastAsiaTheme="minorHAnsi" w:hAnsiTheme="minorHAnsi" w:cstheme="minorHAnsi"/>
@@ -12856,20 +13686,44 @@
           <w:b/>
           <w:bCs/>
         </w:rPr>
-        <w:t xml:space="preserve"> Feasibility and ESIA Studies, Detailed Design, and Construction Supervision for Sanitation Improvements in Three Cities: Pemba, Nampula and Quelimane</w:t>
-      </w:r>
-      <w:r>
-        <w:rPr>
-          <w:rFonts w:asciiTheme="minorHAnsi" w:eastAsiaTheme="minorHAnsi" w:hAnsiTheme="minorHAnsi" w:cstheme="minorHAnsi"/>
-        </w:rPr>
-        <w:t xml:space="preserve">. Preparation of Pre-feasibility and Environmental Scoping Report and ToR for ESIA, public consultation meetings and Preparation of ESIA, including ESMP. </w:t>
-      </w:r>
+        <w:t xml:space="preserve"> Feasibility and ESIA Studies, Detailed Design, and Construction Supervision for Sanitation Improvements in Three Cities: Pemba, Nampula and </w:t>
+      </w:r>
+      <w:proofErr w:type="spellStart"/>
       <w:r>
         <w:rPr>
           <w:rFonts w:asciiTheme="minorHAnsi" w:eastAsiaTheme="minorHAnsi" w:hAnsiTheme="minorHAnsi" w:cstheme="minorHAnsi"/>
           <w:b/>
           <w:bCs/>
         </w:rPr>
+        <w:t>Quelimane</w:t>
+      </w:r>
+      <w:proofErr w:type="spellEnd"/>
+      <w:r>
+        <w:rPr>
+          <w:rFonts w:asciiTheme="minorHAnsi" w:eastAsiaTheme="minorHAnsi" w:hAnsiTheme="minorHAnsi" w:cstheme="minorHAnsi"/>
+        </w:rPr>
+        <w:t xml:space="preserve">. Preparation of Pre-feasibility and Environmental Scoping Report and </w:t>
+      </w:r>
+      <w:proofErr w:type="spellStart"/>
+      <w:r>
+        <w:rPr>
+          <w:rFonts w:asciiTheme="minorHAnsi" w:eastAsiaTheme="minorHAnsi" w:hAnsiTheme="minorHAnsi" w:cstheme="minorHAnsi"/>
+        </w:rPr>
+        <w:t>ToR</w:t>
+      </w:r>
+      <w:proofErr w:type="spellEnd"/>
+      <w:r>
+        <w:rPr>
+          <w:rFonts w:asciiTheme="minorHAnsi" w:eastAsiaTheme="minorHAnsi" w:hAnsiTheme="minorHAnsi" w:cstheme="minorHAnsi"/>
+        </w:rPr>
+        <w:t xml:space="preserve"> for ESIA, public consultation meetings and Preparation of ESIA, including ESMP. </w:t>
+      </w:r>
+      <w:r>
+        <w:rPr>
+          <w:rFonts w:asciiTheme="minorHAnsi" w:eastAsiaTheme="minorHAnsi" w:hAnsiTheme="minorHAnsi" w:cstheme="minorHAnsi"/>
+          <w:b/>
+          <w:bCs/>
+        </w:rPr>
         <w:t>Financed MCC Mozambique</w:t>
       </w:r>
       <w:r>
@@ -12878,10 +13732,10 @@
         </w:rPr>
         <w:t xml:space="preserve">. Prepared for Louis Berger SAS, Luis Macedo. Phone: +258 824833730. </w:t>
       </w:r>
-      <w:hyperlink r:id="rId22" w:history="1">
+      <w:hyperlink r:id="rId21" w:history="1">
         <w:r>
           <w:rPr>
-            <w:rStyle w:val="Hiperligao"/>
+            <w:rStyle w:val="Hyperlink"/>
             <w:rFonts w:asciiTheme="minorHAnsi" w:eastAsiaTheme="minorHAnsi" w:hAnsiTheme="minorHAnsi" w:cstheme="minorHAnsi"/>
             <w:color w:val="auto"/>
             <w:u w:val="none"/>
@@ -12913,20 +13767,56 @@
           <w:b/>
           <w:bCs/>
         </w:rPr>
-        <w:t xml:space="preserve"> Detailed Engineering Design Review, Pre-Contract Services and Supervision of Civil Works of N14 Road, between Marrupa and Ruaça (Lote B). </w:t>
-      </w:r>
-      <w:r>
-        <w:rPr>
-          <w:rFonts w:asciiTheme="minorHAnsi" w:eastAsiaTheme="minorHAnsi" w:hAnsiTheme="minorHAnsi" w:cstheme="minorHAnsi"/>
-        </w:rPr>
-        <w:t>Health and Safety Supervisor and monitoring activities of the implementation of ESIA and ESMP as part of the Project Consultant</w:t>
-      </w:r>
+        <w:t xml:space="preserve"> Detailed Engineering Design Review, Pre-Contract Services and Supervision of Civil Works of N14 Road, between </w:t>
+      </w:r>
+      <w:proofErr w:type="spellStart"/>
       <w:r>
         <w:rPr>
           <w:rFonts w:asciiTheme="minorHAnsi" w:eastAsiaTheme="minorHAnsi" w:hAnsiTheme="minorHAnsi" w:cstheme="minorHAnsi"/>
           <w:b/>
           <w:bCs/>
         </w:rPr>
+        <w:t>Marrupa</w:t>
+      </w:r>
+      <w:proofErr w:type="spellEnd"/>
+      <w:r>
+        <w:rPr>
+          <w:rFonts w:asciiTheme="minorHAnsi" w:eastAsiaTheme="minorHAnsi" w:hAnsiTheme="minorHAnsi" w:cstheme="minorHAnsi"/>
+          <w:b/>
+          <w:bCs/>
+        </w:rPr>
+        <w:t xml:space="preserve"> and </w:t>
+      </w:r>
+      <w:proofErr w:type="spellStart"/>
+      <w:r>
+        <w:rPr>
+          <w:rFonts w:asciiTheme="minorHAnsi" w:eastAsiaTheme="minorHAnsi" w:hAnsiTheme="minorHAnsi" w:cstheme="minorHAnsi"/>
+          <w:b/>
+          <w:bCs/>
+        </w:rPr>
+        <w:t>Ruaça</w:t>
+      </w:r>
+      <w:proofErr w:type="spellEnd"/>
+      <w:r>
+        <w:rPr>
+          <w:rFonts w:asciiTheme="minorHAnsi" w:eastAsiaTheme="minorHAnsi" w:hAnsiTheme="minorHAnsi" w:cstheme="minorHAnsi"/>
+          <w:b/>
+          <w:bCs/>
+        </w:rPr>
+        <w:t xml:space="preserve"> (Lote B). </w:t>
+      </w:r>
+      <w:r>
+        <w:rPr>
+          <w:rFonts w:asciiTheme="minorHAnsi" w:eastAsiaTheme="minorHAnsi" w:hAnsiTheme="minorHAnsi" w:cstheme="minorHAnsi"/>
+        </w:rPr>
+        <w:t>Health and Safety Supervisor and monitoring activities of the implementation of ESIA and ESMP as part of the Project Consultant</w:t>
+      </w:r>
+      <w:r>
+        <w:rPr>
+          <w:rFonts w:asciiTheme="minorHAnsi" w:eastAsiaTheme="minorHAnsi" w:hAnsiTheme="minorHAnsi" w:cstheme="minorHAnsi"/>
+          <w:b/>
+          <w:bCs/>
+        </w:rPr>
         <w:t xml:space="preserve">. Financed by WB. </w:t>
       </w:r>
       <w:r>
@@ -12935,7 +13825,7 @@
         </w:rPr>
         <w:t xml:space="preserve">Prepared for EGIS International (Formerly BCEOM). Sandra Simões Phone: +258-21-496801. </w:t>
       </w:r>
-      <w:hyperlink r:id="rId23" w:history="1">
+      <w:hyperlink r:id="rId22" w:history="1">
         <w:r>
           <w:rPr>
             <w:rFonts w:asciiTheme="minorHAnsi" w:eastAsiaTheme="minorHAnsi" w:hAnsiTheme="minorHAnsi" w:cstheme="minorHAnsi"/>
@@ -12952,7 +13842,7 @@
         <w:spacing w:before="240" w:after="120"/>
         <w:ind w:left="1080"/>
         <w:rPr>
-          <w:rStyle w:val="Hiperligao"/>
+          <w:rStyle w:val="Hyperlink"/>
           <w:rFonts w:asciiTheme="minorHAnsi" w:eastAsia="Batang" w:hAnsiTheme="minorHAnsi" w:cstheme="minorHAnsi"/>
           <w:color w:val="auto"/>
           <w:u w:val="none"/>
@@ -12983,12 +13873,26 @@
         <w:rPr>
           <w:rFonts w:asciiTheme="minorHAnsi" w:hAnsiTheme="minorHAnsi" w:cstheme="minorHAnsi"/>
         </w:rPr>
-        <w:t xml:space="preserve">. Prepared for Brisbane City Enterprises Pty Ltd &amp; Smec International Pty Ltd Mozambique. Contact: Madeira Fredy Madeira. Phone: +258 21415572. </w:t>
-      </w:r>
-      <w:hyperlink r:id="rId24" w:history="1">
+        <w:t xml:space="preserve">. Prepared for Brisbane City Enterprises Pty Ltd &amp; </w:t>
+      </w:r>
+      <w:proofErr w:type="spellStart"/>
+      <w:r>
+        <w:rPr>
+          <w:rFonts w:asciiTheme="minorHAnsi" w:hAnsiTheme="minorHAnsi" w:cstheme="minorHAnsi"/>
+        </w:rPr>
+        <w:t>Smec</w:t>
+      </w:r>
+      <w:proofErr w:type="spellEnd"/>
+      <w:r>
+        <w:rPr>
+          <w:rFonts w:asciiTheme="minorHAnsi" w:hAnsiTheme="minorHAnsi" w:cstheme="minorHAnsi"/>
+        </w:rPr>
+        <w:t xml:space="preserve"> International Pty Ltd Mozambique. Contact: Madeira Fredy Madeira. Phone: +258 21415572. </w:t>
+      </w:r>
+      <w:hyperlink r:id="rId23" w:history="1">
         <w:r>
           <w:rPr>
-            <w:rStyle w:val="Hiperligao"/>
+            <w:rStyle w:val="Hyperlink"/>
             <w:rFonts w:asciiTheme="minorHAnsi" w:eastAsia="Batang" w:hAnsiTheme="minorHAnsi" w:cstheme="minorHAnsi"/>
             <w:color w:val="auto"/>
             <w:u w:val="none"/>
@@ -13013,7 +13917,53 @@
           <w:rFonts w:asciiTheme="minorHAnsi" w:hAnsiTheme="minorHAnsi" w:cstheme="minorHAnsi"/>
           <w:b/>
         </w:rPr>
-        <w:t xml:space="preserve">October 209: Detailed Engineering Design Review, Pre-Contract Services and Supervision of Civil Works of N14 Road, between Marrupa and Ruaça (Lote B). </w:t>
+        <w:t>October 20</w:t>
+      </w:r>
+      <w:r>
+        <w:rPr>
+          <w:rFonts w:asciiTheme="minorHAnsi" w:hAnsiTheme="minorHAnsi" w:cstheme="minorHAnsi"/>
+          <w:b/>
+        </w:rPr>
+        <w:t>0</w:t>
+      </w:r>
+      <w:r>
+        <w:rPr>
+          <w:rFonts w:asciiTheme="minorHAnsi" w:hAnsiTheme="minorHAnsi" w:cstheme="minorHAnsi"/>
+          <w:b/>
+        </w:rPr>
+        <w:t xml:space="preserve">9: Detailed Engineering Design Review, Pre-Contract Services and Supervision of Civil Works of N14 Road, between </w:t>
+      </w:r>
+      <w:proofErr w:type="spellStart"/>
+      <w:r>
+        <w:rPr>
+          <w:rFonts w:asciiTheme="minorHAnsi" w:hAnsiTheme="minorHAnsi" w:cstheme="minorHAnsi"/>
+          <w:b/>
+        </w:rPr>
+        <w:t>Marrupa</w:t>
+      </w:r>
+      <w:proofErr w:type="spellEnd"/>
+      <w:r>
+        <w:rPr>
+          <w:rFonts w:asciiTheme="minorHAnsi" w:hAnsiTheme="minorHAnsi" w:cstheme="minorHAnsi"/>
+          <w:b/>
+        </w:rPr>
+        <w:t xml:space="preserve"> and </w:t>
+      </w:r>
+      <w:proofErr w:type="spellStart"/>
+      <w:r>
+        <w:rPr>
+          <w:rFonts w:asciiTheme="minorHAnsi" w:hAnsiTheme="minorHAnsi" w:cstheme="minorHAnsi"/>
+          <w:b/>
+        </w:rPr>
+        <w:t>Ruaça</w:t>
+      </w:r>
+      <w:proofErr w:type="spellEnd"/>
+      <w:r>
+        <w:rPr>
+          <w:rFonts w:asciiTheme="minorHAnsi" w:hAnsiTheme="minorHAnsi" w:cstheme="minorHAnsi"/>
+          <w:b/>
+        </w:rPr>
+        <w:t xml:space="preserve"> (Lote B). </w:t>
       </w:r>
       <w:r>
         <w:rPr>
@@ -13040,12 +13990,29 @@
           <w:rFonts w:asciiTheme="minorHAnsi" w:hAnsiTheme="minorHAnsi" w:cstheme="minorHAnsi"/>
           <w:bCs/>
         </w:rPr>
-        <w:t xml:space="preserve">Société Française ´Ingenierie (BCEOM). </w:t>
-      </w:r>
-      <w:r>
-        <w:rPr>
-          <w:rFonts w:asciiTheme="minorHAnsi" w:hAnsiTheme="minorHAnsi" w:cstheme="minorHAnsi"/>
-        </w:rPr>
+        <w:t>Société Française ´</w:t>
+      </w:r>
+      <w:proofErr w:type="spellStart"/>
+      <w:r>
+        <w:rPr>
+          <w:rFonts w:asciiTheme="minorHAnsi" w:hAnsiTheme="minorHAnsi" w:cstheme="minorHAnsi"/>
+          <w:bCs/>
+        </w:rPr>
+        <w:t>Ingenierie</w:t>
+      </w:r>
+      <w:proofErr w:type="spellEnd"/>
+      <w:r>
+        <w:rPr>
+          <w:rFonts w:asciiTheme="minorHAnsi" w:hAnsiTheme="minorHAnsi" w:cstheme="minorHAnsi"/>
+          <w:bCs/>
+        </w:rPr>
+        <w:t xml:space="preserve"> (BCEOM). </w:t>
+      </w:r>
+      <w:r>
+        <w:rPr>
+          <w:rFonts w:asciiTheme="minorHAnsi" w:hAnsiTheme="minorHAnsi" w:cstheme="minorHAnsi"/>
+        </w:rPr>
+        <w:lastRenderedPageBreak/>
         <w:t xml:space="preserve">Sandra Simões. </w:t>
       </w:r>
       <w:r>
@@ -13054,7 +14021,6 @@
           <w:noProof/>
           <w:highlight w:val="yellow"/>
         </w:rPr>
-        <w:lastRenderedPageBreak/>
         <mc:AlternateContent>
           <mc:Choice Requires="wpg">
             <w:drawing>
@@ -13281,10 +14247,10 @@
         </w:rPr>
         <w:t xml:space="preserve">Phone: +258-21-496801. </w:t>
       </w:r>
-      <w:hyperlink r:id="rId25" w:history="1">
+      <w:hyperlink r:id="rId24" w:history="1">
         <w:r>
           <w:rPr>
-            <w:rStyle w:val="Hiperligao"/>
+            <w:rStyle w:val="Hyperlink"/>
             <w:rFonts w:asciiTheme="minorHAnsi" w:eastAsia="Batang" w:hAnsiTheme="minorHAnsi" w:cstheme="minorHAnsi"/>
             <w:color w:val="auto"/>
             <w:u w:val="none"/>
@@ -13309,13 +14275,44 @@
           <w:rFonts w:asciiTheme="minorHAnsi" w:hAnsiTheme="minorHAnsi" w:cstheme="minorHAnsi"/>
           <w:b/>
         </w:rPr>
-        <w:t>2007-2008: Detailed Feasibility and Engineering Design Study, and Environmental and Social Impact Assessment (ESIA) for the Upgrading of the Milange-Mocuba Road</w:t>
-      </w:r>
-      <w:r>
-        <w:rPr>
-          <w:rFonts w:asciiTheme="minorHAnsi" w:hAnsiTheme="minorHAnsi" w:cstheme="minorHAnsi"/>
-        </w:rPr>
-        <w:t xml:space="preserve">.Rreview of existing reports, visit of site to update and harmonize the data collected previously and assess the impacts of the various potential options; Consultation with specialists in the consultant team, as well as limited consultations with authorities and stakeholders; and preparation of the ESIA and EMP final Report. </w:t>
+        <w:t xml:space="preserve">2007-2008: Detailed Feasibility and Engineering Design Study, and Environmental and Social Impact Assessment (ESIA) for the Upgrading of the </w:t>
+      </w:r>
+      <w:proofErr w:type="spellStart"/>
+      <w:r>
+        <w:rPr>
+          <w:rFonts w:asciiTheme="minorHAnsi" w:hAnsiTheme="minorHAnsi" w:cstheme="minorHAnsi"/>
+          <w:b/>
+        </w:rPr>
+        <w:t>Milange-Mocuba</w:t>
+      </w:r>
+      <w:proofErr w:type="spellEnd"/>
+      <w:r>
+        <w:rPr>
+          <w:rFonts w:asciiTheme="minorHAnsi" w:hAnsiTheme="minorHAnsi" w:cstheme="minorHAnsi"/>
+          <w:b/>
+        </w:rPr>
+        <w:t xml:space="preserve"> </w:t>
+      </w:r>
+      <w:proofErr w:type="spellStart"/>
+      <w:r>
+        <w:rPr>
+          <w:rFonts w:asciiTheme="minorHAnsi" w:hAnsiTheme="minorHAnsi" w:cstheme="minorHAnsi"/>
+          <w:b/>
+        </w:rPr>
+        <w:t>Road</w:t>
+      </w:r>
+      <w:r>
+        <w:rPr>
+          <w:rFonts w:asciiTheme="minorHAnsi" w:hAnsiTheme="minorHAnsi" w:cstheme="minorHAnsi"/>
+        </w:rPr>
+        <w:t>.Rreview</w:t>
+      </w:r>
+      <w:proofErr w:type="spellEnd"/>
+      <w:r>
+        <w:rPr>
+          <w:rFonts w:asciiTheme="minorHAnsi" w:hAnsiTheme="minorHAnsi" w:cstheme="minorHAnsi"/>
+        </w:rPr>
+        <w:t xml:space="preserve"> of existing reports, visit of site to update and harmonize the data collected previously and assess the impacts of the various potential options; Consultation with specialists in the consultant team, as well as limited consultations with authorities and stakeholders; and preparation of the ESIA and EMP final Report. </w:t>
       </w:r>
       <w:r>
         <w:rPr>
@@ -13352,10 +14349,10 @@
         </w:rPr>
         <w:t xml:space="preserve">Sandra Simões. Phone: +258-21-496801. </w:t>
       </w:r>
-      <w:hyperlink r:id="rId26" w:history="1">
+      <w:hyperlink r:id="rId25" w:history="1">
         <w:r>
           <w:rPr>
-            <w:rStyle w:val="Hiperligao"/>
+            <w:rStyle w:val="Hyperlink"/>
             <w:rFonts w:asciiTheme="minorHAnsi" w:eastAsia="Batang" w:hAnsiTheme="minorHAnsi" w:cstheme="minorHAnsi"/>
             <w:color w:val="auto"/>
             <w:u w:val="none"/>
@@ -13388,7 +14385,21 @@
         <w:rPr>
           <w:rFonts w:asciiTheme="minorHAnsi" w:hAnsiTheme="minorHAnsi" w:cstheme="minorHAnsi"/>
         </w:rPr>
-        <w:t xml:space="preserve"> Preparation of instruction of the process for categorization, including the close of the preliminary Environmental Information Sheet, Pre-feasibility and Environmental Scoping Report and ToR for ESIA and ESMP, as well as organization of the public consultation meetings; and Preparation of the ESIA and EMP final Report. </w:t>
+        <w:t xml:space="preserve"> Preparation of instruction of the process for categorization, including the close of the preliminary Environmental Information Sheet, Pre-feasibility and Environmental Scoping Report and </w:t>
+      </w:r>
+      <w:proofErr w:type="spellStart"/>
+      <w:r>
+        <w:rPr>
+          <w:rFonts w:asciiTheme="minorHAnsi" w:hAnsiTheme="minorHAnsi" w:cstheme="minorHAnsi"/>
+        </w:rPr>
+        <w:t>ToR</w:t>
+      </w:r>
+      <w:proofErr w:type="spellEnd"/>
+      <w:r>
+        <w:rPr>
+          <w:rFonts w:asciiTheme="minorHAnsi" w:hAnsiTheme="minorHAnsi" w:cstheme="minorHAnsi"/>
+        </w:rPr>
+        <w:t xml:space="preserve"> for ESIA and ESMP, as well as organization of the public consultation meetings; and Preparation of the ESIA and EMP final Report. </w:t>
       </w:r>
       <w:r>
         <w:rPr>
@@ -13402,12 +14413,26 @@
         <w:rPr>
           <w:rFonts w:asciiTheme="minorHAnsi" w:hAnsiTheme="minorHAnsi" w:cstheme="minorHAnsi"/>
         </w:rPr>
-        <w:t xml:space="preserve">. Prepared for Mohan Exports Corporation, Division of Mohan Exports (India) PVT. LTD). Rahul Talwelkar Phone: +91-11-26432802-5. </w:t>
-      </w:r>
-      <w:hyperlink r:id="rId27" w:history="1">
+        <w:t xml:space="preserve">. Prepared for Mohan Exports Corporation, Division of Mohan Exports (India) PVT. LTD). Rahul </w:t>
+      </w:r>
+      <w:proofErr w:type="spellStart"/>
+      <w:r>
+        <w:rPr>
+          <w:rFonts w:asciiTheme="minorHAnsi" w:hAnsiTheme="minorHAnsi" w:cstheme="minorHAnsi"/>
+        </w:rPr>
+        <w:t>Talwelkar</w:t>
+      </w:r>
+      <w:proofErr w:type="spellEnd"/>
+      <w:r>
+        <w:rPr>
+          <w:rFonts w:asciiTheme="minorHAnsi" w:hAnsiTheme="minorHAnsi" w:cstheme="minorHAnsi"/>
+        </w:rPr>
+        <w:t xml:space="preserve"> Phone: +91-11-26432802-5. </w:t>
+      </w:r>
+      <w:hyperlink r:id="rId26" w:history="1">
         <w:r>
           <w:rPr>
-            <w:rStyle w:val="Hiperligao"/>
+            <w:rStyle w:val="Hyperlink"/>
             <w:rFonts w:asciiTheme="minorHAnsi" w:eastAsia="Batang" w:hAnsiTheme="minorHAnsi" w:cstheme="minorHAnsi"/>
             <w:color w:val="auto"/>
             <w:u w:val="none"/>
@@ -13438,7 +14463,71 @@
           <w:rFonts w:asciiTheme="minorHAnsi" w:hAnsiTheme="minorHAnsi" w:cstheme="minorHAnsi"/>
           <w:b/>
         </w:rPr>
-        <w:t>Detailed Feasibility and Engineering Design Study, and ESIA for the Rehabilitation of EN1 between Namacurra-Rio Ligonha (Section 1: Namacurra-Rio Ligonha Lot 1).</w:t>
+        <w:t xml:space="preserve">Detailed Feasibility and Engineering Design Study, and ESIA for the Rehabilitation of EN1 between </w:t>
+      </w:r>
+      <w:proofErr w:type="spellStart"/>
+      <w:r>
+        <w:rPr>
+          <w:rFonts w:asciiTheme="minorHAnsi" w:hAnsiTheme="minorHAnsi" w:cstheme="minorHAnsi"/>
+          <w:b/>
+        </w:rPr>
+        <w:t>Namacurra</w:t>
+      </w:r>
+      <w:proofErr w:type="spellEnd"/>
+      <w:r>
+        <w:rPr>
+          <w:rFonts w:asciiTheme="minorHAnsi" w:hAnsiTheme="minorHAnsi" w:cstheme="minorHAnsi"/>
+          <w:b/>
+        </w:rPr>
+        <w:t xml:space="preserve">-Rio </w:t>
+      </w:r>
+      <w:proofErr w:type="spellStart"/>
+      <w:r>
+        <w:rPr>
+          <w:rFonts w:asciiTheme="minorHAnsi" w:hAnsiTheme="minorHAnsi" w:cstheme="minorHAnsi"/>
+          <w:b/>
+        </w:rPr>
+        <w:t>Ligonha</w:t>
+      </w:r>
+      <w:proofErr w:type="spellEnd"/>
+      <w:r>
+        <w:rPr>
+          <w:rFonts w:asciiTheme="minorHAnsi" w:hAnsiTheme="minorHAnsi" w:cstheme="minorHAnsi"/>
+          <w:b/>
+        </w:rPr>
+        <w:t xml:space="preserve"> (Section 1: </w:t>
+      </w:r>
+      <w:proofErr w:type="spellStart"/>
+      <w:r>
+        <w:rPr>
+          <w:rFonts w:asciiTheme="minorHAnsi" w:hAnsiTheme="minorHAnsi" w:cstheme="minorHAnsi"/>
+          <w:b/>
+        </w:rPr>
+        <w:t>Namacurra</w:t>
+      </w:r>
+      <w:proofErr w:type="spellEnd"/>
+      <w:r>
+        <w:rPr>
+          <w:rFonts w:asciiTheme="minorHAnsi" w:hAnsiTheme="minorHAnsi" w:cstheme="minorHAnsi"/>
+          <w:b/>
+        </w:rPr>
+        <w:t xml:space="preserve">-Rio </w:t>
+      </w:r>
+      <w:proofErr w:type="spellStart"/>
+      <w:r>
+        <w:rPr>
+          <w:rFonts w:asciiTheme="minorHAnsi" w:hAnsiTheme="minorHAnsi" w:cstheme="minorHAnsi"/>
+          <w:b/>
+        </w:rPr>
+        <w:t>Ligonha</w:t>
+      </w:r>
+      <w:proofErr w:type="spellEnd"/>
+      <w:r>
+        <w:rPr>
+          <w:rFonts w:asciiTheme="minorHAnsi" w:hAnsiTheme="minorHAnsi" w:cstheme="minorHAnsi"/>
+          <w:b/>
+        </w:rPr>
+        <w:t xml:space="preserve"> Lot 1).</w:t>
       </w:r>
       <w:r>
         <w:rPr>
@@ -13477,7 +14566,23 @@
           <w:rFonts w:asciiTheme="minorHAnsi" w:hAnsiTheme="minorHAnsi" w:cstheme="minorHAnsi"/>
           <w:bCs/>
         </w:rPr>
-        <w:t xml:space="preserve">Société Française ´Ingenierie (BCEOM). </w:t>
+        <w:t>Société Française ´</w:t>
+      </w:r>
+      <w:proofErr w:type="spellStart"/>
+      <w:r>
+        <w:rPr>
+          <w:rFonts w:asciiTheme="minorHAnsi" w:hAnsiTheme="minorHAnsi" w:cstheme="minorHAnsi"/>
+          <w:bCs/>
+        </w:rPr>
+        <w:t>Ingenierie</w:t>
+      </w:r>
+      <w:proofErr w:type="spellEnd"/>
+      <w:r>
+        <w:rPr>
+          <w:rFonts w:asciiTheme="minorHAnsi" w:hAnsiTheme="minorHAnsi" w:cstheme="minorHAnsi"/>
+          <w:bCs/>
+        </w:rPr>
+        <w:t xml:space="preserve"> (BCEOM). </w:t>
       </w:r>
       <w:r>
         <w:rPr>
@@ -13485,10 +14590,10 @@
         </w:rPr>
         <w:t xml:space="preserve">Sandra Simões. Phone: +258-21-496801. </w:t>
       </w:r>
-      <w:hyperlink r:id="rId28" w:history="1">
+      <w:hyperlink r:id="rId27" w:history="1">
         <w:r>
           <w:rPr>
-            <w:rStyle w:val="Hiperligao"/>
+            <w:rStyle w:val="Hyperlink"/>
             <w:rFonts w:asciiTheme="minorHAnsi" w:eastAsia="Batang" w:hAnsiTheme="minorHAnsi" w:cstheme="minorHAnsi"/>
             <w:color w:val="auto"/>
             <w:u w:val="none"/>
@@ -13514,32 +14619,96 @@
           <w:b/>
           <w:bCs/>
         </w:rPr>
-        <w:t>2002-2002: Detailed Feasibility and Engineering Design Study, and Environmental and Social Impact Assessment for the Rehabilitation of EN1 between Nhachengue Cr. ER520 and Vilanculos Cr. ER212, Inhambane Province</w:t>
-      </w:r>
-      <w:r>
-        <w:rPr>
-          <w:rFonts w:asciiTheme="minorHAnsi" w:hAnsiTheme="minorHAnsi" w:cstheme="minorHAnsi"/>
-        </w:rPr>
-        <w:t xml:space="preserve">. Preparation of the ESMP undertaking of the baseline study including community and other stakeholders or interested parties’ consultation, identification and assessment of possible sites for borrow pits, as well conduction of the social impact assessment of the project, and public consultation, and compilation of the data collected and elaboration of the final ESMP Report. </w:t>
-      </w:r>
+        <w:t xml:space="preserve">2002-2002: Detailed Feasibility and Engineering Design Study, and Environmental and Social Impact Assessment for the Rehabilitation of EN1 between </w:t>
+      </w:r>
+      <w:proofErr w:type="spellStart"/>
       <w:r>
         <w:rPr>
           <w:rFonts w:asciiTheme="minorHAnsi" w:hAnsiTheme="minorHAnsi" w:cstheme="minorHAnsi"/>
           <w:b/>
           <w:bCs/>
         </w:rPr>
+        <w:t>Nhachengue</w:t>
+      </w:r>
+      <w:proofErr w:type="spellEnd"/>
+      <w:r>
+        <w:rPr>
+          <w:rFonts w:asciiTheme="minorHAnsi" w:hAnsiTheme="minorHAnsi" w:cstheme="minorHAnsi"/>
+          <w:b/>
+          <w:bCs/>
+        </w:rPr>
+        <w:t xml:space="preserve"> Cr. ER520 and </w:t>
+      </w:r>
+      <w:proofErr w:type="spellStart"/>
+      <w:r>
+        <w:rPr>
+          <w:rFonts w:asciiTheme="minorHAnsi" w:hAnsiTheme="minorHAnsi" w:cstheme="minorHAnsi"/>
+          <w:b/>
+          <w:bCs/>
+        </w:rPr>
+        <w:t>Vilanculos</w:t>
+      </w:r>
+      <w:proofErr w:type="spellEnd"/>
+      <w:r>
+        <w:rPr>
+          <w:rFonts w:asciiTheme="minorHAnsi" w:hAnsiTheme="minorHAnsi" w:cstheme="minorHAnsi"/>
+          <w:b/>
+          <w:bCs/>
+        </w:rPr>
+        <w:t xml:space="preserve"> Cr. ER212, Inhambane Province</w:t>
+      </w:r>
+      <w:r>
+        <w:rPr>
+          <w:rFonts w:asciiTheme="minorHAnsi" w:hAnsiTheme="minorHAnsi" w:cstheme="minorHAnsi"/>
+        </w:rPr>
+        <w:t xml:space="preserve">. Preparation of the ESMP undertaking of the baseline study including community and other stakeholders or interested parties’ consultation, identification and assessment of possible sites for borrow pits, as well conduction of the social impact assessment of the project, and public consultation, and compilation of the data collected and elaboration of the final ESMP Report. </w:t>
+      </w:r>
+      <w:r>
+        <w:rPr>
+          <w:rFonts w:asciiTheme="minorHAnsi" w:hAnsiTheme="minorHAnsi" w:cstheme="minorHAnsi"/>
+          <w:b/>
+          <w:bCs/>
+        </w:rPr>
         <w:t>Financed by EU</w:t>
       </w:r>
       <w:r>
         <w:rPr>
           <w:rFonts w:asciiTheme="minorHAnsi" w:hAnsiTheme="minorHAnsi" w:cstheme="minorHAnsi"/>
         </w:rPr>
-        <w:t>. Prepared by Austral Consultoria e Projectos, Lda &amp; WSP-MBS Consulting Engineers. Luis Magaço, Phone: +258-21-486794.</w:t>
-      </w:r>
-      <w:hyperlink r:id="rId29" w:history="1">
+        <w:t xml:space="preserve">. Prepared by Austral Consultoria e </w:t>
+      </w:r>
+      <w:proofErr w:type="spellStart"/>
+      <w:r>
+        <w:rPr>
+          <w:rFonts w:asciiTheme="minorHAnsi" w:hAnsiTheme="minorHAnsi" w:cstheme="minorHAnsi"/>
+        </w:rPr>
+        <w:t>Projectos</w:t>
+      </w:r>
+      <w:proofErr w:type="spellEnd"/>
+      <w:r>
+        <w:rPr>
+          <w:rFonts w:asciiTheme="minorHAnsi" w:hAnsiTheme="minorHAnsi" w:cstheme="minorHAnsi"/>
+        </w:rPr>
+        <w:t xml:space="preserve">, </w:t>
+      </w:r>
+      <w:proofErr w:type="spellStart"/>
+      <w:r>
+        <w:rPr>
+          <w:rFonts w:asciiTheme="minorHAnsi" w:hAnsiTheme="minorHAnsi" w:cstheme="minorHAnsi"/>
+        </w:rPr>
+        <w:t>Lda</w:t>
+      </w:r>
+      <w:proofErr w:type="spellEnd"/>
+      <w:r>
+        <w:rPr>
+          <w:rFonts w:asciiTheme="minorHAnsi" w:hAnsiTheme="minorHAnsi" w:cstheme="minorHAnsi"/>
+        </w:rPr>
+        <w:t xml:space="preserve"> &amp; WSP-MBS Consulting Engineers. Luis Magaço, Phone: +258-21-486794.</w:t>
+      </w:r>
+      <w:hyperlink r:id="rId28" w:history="1">
         <w:r>
           <w:rPr>
-            <w:rStyle w:val="Hiperligao"/>
+            <w:rStyle w:val="Hyperlink"/>
             <w:rFonts w:asciiTheme="minorHAnsi" w:eastAsia="Batang" w:hAnsiTheme="minorHAnsi" w:cstheme="minorHAnsi"/>
             <w:color w:val="auto"/>
             <w:u w:val="none"/>
@@ -13866,12 +15035,14 @@
                               </w:rPr>
                               <w:t xml:space="preserve"> </w:t>
                             </w:r>
+                            <w:proofErr w:type="spellStart"/>
                             <w:r>
                               <w:rPr>
                                 <w:sz w:val="14"/>
                               </w:rPr>
                               <w:t>Cidade</w:t>
                             </w:r>
+                            <w:proofErr w:type="spellEnd"/>
                             <w:r>
                               <w:rPr>
                                 <w:spacing w:val="-4"/>
@@ -14189,12 +15360,14 @@
                         </w:rPr>
                         <w:t xml:space="preserve"> </w:t>
                       </w:r>
+                      <w:proofErr w:type="spellStart"/>
                       <w:r>
                         <w:rPr>
                           <w:sz w:val="14"/>
                         </w:rPr>
                         <w:t>Cidade</w:t>
                       </w:r>
+                      <w:proofErr w:type="spellEnd"/>
                       <w:r>
                         <w:rPr>
                           <w:spacing w:val="-4"/>
@@ -14246,7 +15419,7 @@
     </w:p>
     <w:p>
       <w:pPr>
-        <w:pStyle w:val="Corpodetexto"/>
+        <w:pStyle w:val="BodyText"/>
         <w:numPr>
           <w:ilvl w:val="0"/>
           <w:numId w:val="6"/>
@@ -14310,8 +15483,17 @@
           <w:rFonts w:asciiTheme="minorHAnsi" w:hAnsiTheme="minorHAnsi" w:cstheme="minorHAnsi"/>
           <w:b/>
         </w:rPr>
-        <w:t>Arcangelo Passela</w:t>
-      </w:r>
+        <w:t xml:space="preserve">Arcangelo </w:t>
+      </w:r>
+      <w:proofErr w:type="spellStart"/>
+      <w:r>
+        <w:rPr>
+          <w:rFonts w:asciiTheme="minorHAnsi" w:hAnsiTheme="minorHAnsi" w:cstheme="minorHAnsi"/>
+          <w:b/>
+        </w:rPr>
+        <w:t>Passela</w:t>
+      </w:r>
+      <w:proofErr w:type="spellEnd"/>
       <w:r>
         <w:rPr>
           <w:rFonts w:asciiTheme="minorHAnsi" w:hAnsiTheme="minorHAnsi" w:cstheme="minorHAnsi"/>
@@ -14382,7 +15564,25 @@
           <w:rFonts w:asciiTheme="minorHAnsi" w:hAnsiTheme="minorHAnsi" w:cstheme="minorHAnsi"/>
           <w:lang w:val="en"/>
         </w:rPr>
-        <w:t xml:space="preserve">in the Universidad Europea del Altántico in Spain. </w:t>
+        <w:t xml:space="preserve">in the Universidad Europea del </w:t>
+      </w:r>
+      <w:proofErr w:type="spellStart"/>
+      <w:r>
+        <w:rPr>
+          <w:rStyle w:val="q4iawc"/>
+          <w:rFonts w:asciiTheme="minorHAnsi" w:hAnsiTheme="minorHAnsi" w:cstheme="minorHAnsi"/>
+          <w:lang w:val="en"/>
+        </w:rPr>
+        <w:t>Altántico</w:t>
+      </w:r>
+      <w:proofErr w:type="spellEnd"/>
+      <w:r>
+        <w:rPr>
+          <w:rStyle w:val="q4iawc"/>
+          <w:rFonts w:asciiTheme="minorHAnsi" w:hAnsiTheme="minorHAnsi" w:cstheme="minorHAnsi"/>
+          <w:lang w:val="en"/>
+        </w:rPr>
+        <w:t xml:space="preserve"> in Spain. </w:t>
       </w:r>
     </w:p>
     <w:p>
@@ -14401,7 +15601,25 @@
           <w:rFonts w:asciiTheme="minorHAnsi" w:hAnsiTheme="minorHAnsi" w:cstheme="minorHAnsi"/>
           <w:lang w:val="en"/>
         </w:rPr>
-        <w:t xml:space="preserve">In 1998, the Mr. Passela attended the specialization course in Environmental and Social Impact Assessment (ESIA) at the Geosciences Department of the Aveiro University, Portugal, becoming one of the first professionals in Environmental Impact Studies in the country, having been certified in 2002 by the Ministry of Land and Environment (MTA), as an Environmental Consultant. In 2018 he was also certified by the MTA as an Environmental Auditor. </w:t>
+        <w:t xml:space="preserve">In 1998, the Mr. </w:t>
+      </w:r>
+      <w:proofErr w:type="spellStart"/>
+      <w:r>
+        <w:rPr>
+          <w:rStyle w:val="q4iawc"/>
+          <w:rFonts w:asciiTheme="minorHAnsi" w:hAnsiTheme="minorHAnsi" w:cstheme="minorHAnsi"/>
+          <w:lang w:val="en"/>
+        </w:rPr>
+        <w:t>Passela</w:t>
+      </w:r>
+      <w:proofErr w:type="spellEnd"/>
+      <w:r>
+        <w:rPr>
+          <w:rStyle w:val="q4iawc"/>
+          <w:rFonts w:asciiTheme="minorHAnsi" w:hAnsiTheme="minorHAnsi" w:cstheme="minorHAnsi"/>
+          <w:lang w:val="en"/>
+        </w:rPr>
+        <w:t xml:space="preserve"> attended the specialization course in Environmental and Social Impact Assessment (ESIA) at the Geosciences Department of the Aveiro University, Portugal, becoming one of the first professionals in Environmental Impact Studies in the country, having been certified in 2002 by the Ministry of Land and Environment (MTA), as an Environmental Consultant. In 2018 he was also certified by the MTA as an Environmental Auditor. </w:t>
       </w:r>
     </w:p>
     <w:p>
@@ -14421,7 +15639,25 @@
           <w:lang w:val="en"/>
         </w:rPr>
         <w:lastRenderedPageBreak/>
-        <w:t xml:space="preserve">As Environmental Consultant, the experience of Mr. Arcangelo Passela is marked by the realization and participation in several ESIAs of different national development projects, especially in the sectors of mining, tourism, agriculture, energy, roads and development infrastructure, etc., financed by private international institutions, namely the World Bank (WB), African Development Bank (AfDB), Japan International Cooperation Agency (JICA), etc. </w:t>
+        <w:t xml:space="preserve">As Environmental Consultant, the experience of Mr. Arcangelo </w:t>
+      </w:r>
+      <w:proofErr w:type="spellStart"/>
+      <w:r>
+        <w:rPr>
+          <w:rStyle w:val="q4iawc"/>
+          <w:rFonts w:asciiTheme="minorHAnsi" w:hAnsiTheme="minorHAnsi" w:cstheme="minorHAnsi"/>
+          <w:lang w:val="en"/>
+        </w:rPr>
+        <w:t>Passela</w:t>
+      </w:r>
+      <w:proofErr w:type="spellEnd"/>
+      <w:r>
+        <w:rPr>
+          <w:rStyle w:val="q4iawc"/>
+          <w:rFonts w:asciiTheme="minorHAnsi" w:hAnsiTheme="minorHAnsi" w:cstheme="minorHAnsi"/>
+          <w:lang w:val="en"/>
+        </w:rPr>
+        <w:t xml:space="preserve"> is marked by the realization and participation in several ESIAs of different national development projects, especially in the sectors of mining, tourism, agriculture, energy, roads and development infrastructure, etc., financed by private international institutions, namely the World Bank (WB), African Development Bank (AfDB), Japan International Cooperation Agency (JICA), etc. </w:t>
       </w:r>
     </w:p>
     <w:p>
@@ -14995,12 +16231,14 @@
                               </w:rPr>
                               <w:t xml:space="preserve"> </w:t>
                             </w:r>
+                            <w:proofErr w:type="spellStart"/>
                             <w:r>
                               <w:rPr>
                                 <w:sz w:val="14"/>
                               </w:rPr>
                               <w:t>Cidade</w:t>
                             </w:r>
+                            <w:proofErr w:type="spellEnd"/>
                             <w:r>
                               <w:rPr>
                                 <w:spacing w:val="-4"/>
@@ -15318,12 +16556,14 @@
                         </w:rPr>
                         <w:t xml:space="preserve"> </w:t>
                       </w:r>
+                      <w:proofErr w:type="spellStart"/>
                       <w:r>
                         <w:rPr>
                           <w:sz w:val="14"/>
                         </w:rPr>
                         <w:t>Cidade</w:t>
                       </w:r>
+                      <w:proofErr w:type="spellEnd"/>
                       <w:r>
                         <w:rPr>
                           <w:spacing w:val="-4"/>
@@ -15433,7 +16673,79 @@
           <w:rFonts w:asciiTheme="minorHAnsi" w:hAnsiTheme="minorHAnsi" w:cstheme="minorHAnsi"/>
           <w:lang w:val="en"/>
         </w:rPr>
-        <w:t xml:space="preserve"> is degree in Geology at Eduardo Mondlane University (2001); Post-Graduated in Socioeconomic of Development at Instituto Superior de Ciências e Tecnologias de Moçambique – Maputo (2011); and MBA in Oil and Gas at Instituto Superior de Ciências e Tecnologias de Moçambique – Maputo (2016)</w:t>
+        <w:t xml:space="preserve"> is degree in Geology at Eduardo Mondlane University (2001); Post-Graduated in Socioeconomic of Development at Instituto Superior de </w:t>
+      </w:r>
+      <w:proofErr w:type="spellStart"/>
+      <w:r>
+        <w:rPr>
+          <w:rStyle w:val="q4iawc"/>
+          <w:rFonts w:asciiTheme="minorHAnsi" w:hAnsiTheme="minorHAnsi" w:cstheme="minorHAnsi"/>
+          <w:lang w:val="en"/>
+        </w:rPr>
+        <w:t>Ciências</w:t>
+      </w:r>
+      <w:proofErr w:type="spellEnd"/>
+      <w:r>
+        <w:rPr>
+          <w:rStyle w:val="q4iawc"/>
+          <w:rFonts w:asciiTheme="minorHAnsi" w:hAnsiTheme="minorHAnsi" w:cstheme="minorHAnsi"/>
+          <w:lang w:val="en"/>
+        </w:rPr>
+        <w:t xml:space="preserve"> e </w:t>
+      </w:r>
+      <w:proofErr w:type="spellStart"/>
+      <w:r>
+        <w:rPr>
+          <w:rStyle w:val="q4iawc"/>
+          <w:rFonts w:asciiTheme="minorHAnsi" w:hAnsiTheme="minorHAnsi" w:cstheme="minorHAnsi"/>
+          <w:lang w:val="en"/>
+        </w:rPr>
+        <w:t>Tecnologias</w:t>
+      </w:r>
+      <w:proofErr w:type="spellEnd"/>
+      <w:r>
+        <w:rPr>
+          <w:rStyle w:val="q4iawc"/>
+          <w:rFonts w:asciiTheme="minorHAnsi" w:hAnsiTheme="minorHAnsi" w:cstheme="minorHAnsi"/>
+          <w:lang w:val="en"/>
+        </w:rPr>
+        <w:t xml:space="preserve"> de Moçambique – Maputo (2011); and MBA in Oil and Gas at Instituto Superior de </w:t>
+      </w:r>
+      <w:proofErr w:type="spellStart"/>
+      <w:r>
+        <w:rPr>
+          <w:rStyle w:val="q4iawc"/>
+          <w:rFonts w:asciiTheme="minorHAnsi" w:hAnsiTheme="minorHAnsi" w:cstheme="minorHAnsi"/>
+          <w:lang w:val="en"/>
+        </w:rPr>
+        <w:t>Ciências</w:t>
+      </w:r>
+      <w:proofErr w:type="spellEnd"/>
+      <w:r>
+        <w:rPr>
+          <w:rStyle w:val="q4iawc"/>
+          <w:rFonts w:asciiTheme="minorHAnsi" w:hAnsiTheme="minorHAnsi" w:cstheme="minorHAnsi"/>
+          <w:lang w:val="en"/>
+        </w:rPr>
+        <w:t xml:space="preserve"> e </w:t>
+      </w:r>
+      <w:proofErr w:type="spellStart"/>
+      <w:r>
+        <w:rPr>
+          <w:rStyle w:val="q4iawc"/>
+          <w:rFonts w:asciiTheme="minorHAnsi" w:hAnsiTheme="minorHAnsi" w:cstheme="minorHAnsi"/>
+          <w:lang w:val="en"/>
+        </w:rPr>
+        <w:t>Tecnologias</w:t>
+      </w:r>
+      <w:proofErr w:type="spellEnd"/>
+      <w:r>
+        <w:rPr>
+          <w:rStyle w:val="q4iawc"/>
+          <w:rFonts w:asciiTheme="minorHAnsi" w:hAnsiTheme="minorHAnsi" w:cstheme="minorHAnsi"/>
+          <w:lang w:val="en"/>
+        </w:rPr>
+        <w:t xml:space="preserve"> de Moçambique – Maputo (2016)</w:t>
       </w:r>
     </w:p>
     <w:p>
@@ -15471,7 +16783,25 @@
           <w:rFonts w:asciiTheme="minorHAnsi" w:hAnsiTheme="minorHAnsi" w:cstheme="minorHAnsi"/>
           <w:lang w:val="en"/>
         </w:rPr>
-        <w:t xml:space="preserve">Currently, working as consultant in Geology of different green field projects in Mozambique and Environmental consultant in mining projects and other factories. I am large experienced in exploration project management of green and brown fields, from grassroots exploration to end of feasibility study; exploration designing and planning, drilling supervision, logging, sampling and QA/QC supervision, mapping, geochemical sampling and interpretation of exploration data’s, geophysical interpretation, modeling using Gemcom, mine planning and grade control and generate target of various commodities for different companies in Mozambique. </w:t>
+        <w:t xml:space="preserve">Currently, working as consultant in Geology of different green field projects in Mozambique and Environmental consultant in mining projects and other factories. I am large experienced in exploration project management of green and brown fields, from grassroots exploration to end of feasibility study; exploration designing and planning, drilling supervision, logging, sampling and QA/QC supervision, mapping, geochemical sampling and interpretation of exploration data’s, geophysical interpretation, modeling using </w:t>
+      </w:r>
+      <w:proofErr w:type="spellStart"/>
+      <w:r>
+        <w:rPr>
+          <w:rStyle w:val="q4iawc"/>
+          <w:rFonts w:asciiTheme="minorHAnsi" w:hAnsiTheme="minorHAnsi" w:cstheme="minorHAnsi"/>
+          <w:lang w:val="en"/>
+        </w:rPr>
+        <w:t>Gemcom</w:t>
+      </w:r>
+      <w:proofErr w:type="spellEnd"/>
+      <w:r>
+        <w:rPr>
+          <w:rStyle w:val="q4iawc"/>
+          <w:rFonts w:asciiTheme="minorHAnsi" w:hAnsiTheme="minorHAnsi" w:cstheme="minorHAnsi"/>
+          <w:lang w:val="en"/>
+        </w:rPr>
+        <w:t xml:space="preserve">, mine planning and grade control and generate target of various commodities for different companies in Mozambique. </w:t>
       </w:r>
     </w:p>
     <w:p>
@@ -15496,7 +16826,7 @@
       </w:r>
     </w:p>
     <w:sectPr>
-      <w:footerReference w:type="default" r:id="rId30"/>
+      <w:footerReference w:type="default" r:id="rId29"/>
       <w:pgSz w:w="11910" w:h="16850"/>
       <w:pgMar w:top="1800" w:right="760" w:bottom="1890" w:left="1680" w:header="450" w:footer="1385" w:gutter="0"/>
       <w:cols w:space="720"/>
@@ -15528,7 +16858,7 @@
 <w:ftr xmlns:wpc="http://schemas.microsoft.com/office/word/2010/wordprocessingCanvas" xmlns:cx="http://schemas.microsoft.com/office/drawing/2014/chartex" xmlns:cx1="http://schemas.microsoft.com/office/drawing/2015/9/8/chartex" xmlns:cx2="http://schemas.microsoft.com/office/drawing/2015/10/21/chartex" xmlns:cx3="http://schemas.microsoft.com/office/drawing/2016/5/9/chartex" xmlns:cx4="http://schemas.microsoft.com/office/drawing/2016/5/10/chartex" xmlns:cx5="http://schemas.microsoft.com/office/drawing/2016/5/11/chartex" xmlns:cx6="http://schemas.microsoft.com/office/drawing/2016/5/12/chartex" xmlns:cx7="http://schemas.microsoft.com/office/drawing/2016/5/13/chartex" xmlns:cx8="http://schemas.microsoft.com/office/drawing/2016/5/14/chartex" xmlns:mc="http://schemas.openxmlformats.org/markup-compatibility/2006" xmlns:aink="http://schemas.microsoft.com/office/drawing/2016/ink" xmlns:am3d="http://schemas.microsoft.com/office/drawing/2017/model3d" xmlns:o="urn:schemas-microsoft-com:office:office" xmlns:oel="http://schemas.microsoft.com/office/2019/extlst" xmlns:r="http://schemas.openxmlformats.org/officeDocument/2006/relationships" xmlns:m="http://schemas.openxmlformats.org/officeDocument/2006/math" xmlns:v="urn:schemas-microsoft-com:vml" xmlns:wp14="http://schemas.microsoft.com/office/word/2010/wordprocessingDrawing" xmlns:wp="http://schemas.openxmlformats.org/drawingml/2006/wordprocessingDrawing" xmlns:w10="urn:schemas-microsoft-com:office:word" xmlns:w="http://schemas.openxmlformats.org/wordprocessingml/2006/main" xmlns:w14="http://schemas.microsoft.com/office/word/2010/wordml" xmlns:w15="http://schemas.microsoft.com/office/word/2012/wordml" xmlns:w16cex="http://schemas.microsoft.com/office/word/2018/wordml/cex" xmlns:w16cid="http://schemas.microsoft.com/office/word/2016/wordml/cid" xmlns:w16="http://schemas.microsoft.com/office/word/2018/wordml" xmlns:w16du="http://schemas.microsoft.com/office/word/2023/wordml/word16du" xmlns:w16sdtdh="http://schemas.microsoft.com/office/word/2020/wordml/sdtdatahash" xmlns:w16sdtfl="http://schemas.microsoft.com/office/word/2024/wordml/sdtformatlock" xmlns:w16se="http://schemas.microsoft.com/office/word/2015/wordml/symex" xmlns:wpg="http://schemas.microsoft.com/office/word/2010/wordprocessingGroup" xmlns:wpi="http://schemas.microsoft.com/office/word/2010/wordprocessingInk" xmlns:wne="http://schemas.microsoft.com/office/word/2006/wordml" xmlns:wps="http://schemas.microsoft.com/office/word/2010/wordprocessingShape" mc:Ignorable="w14 w15 w16se w16cid w16 w16cex w16sdtdh w16sdtfl w16du wp14">
   <w:p>
     <w:pPr>
-      <w:pStyle w:val="Corpodetexto"/>
+      <w:pStyle w:val="BodyText"/>
       <w:spacing w:line="14" w:lineRule="auto"/>
     </w:pPr>
     <w:r>
@@ -17775,7 +19105,7 @@
 <w:ftr xmlns:wpc="http://schemas.microsoft.com/office/word/2010/wordprocessingCanvas" xmlns:cx="http://schemas.microsoft.com/office/drawing/2014/chartex" xmlns:cx1="http://schemas.microsoft.com/office/drawing/2015/9/8/chartex" xmlns:cx2="http://schemas.microsoft.com/office/drawing/2015/10/21/chartex" xmlns:cx3="http://schemas.microsoft.com/office/drawing/2016/5/9/chartex" xmlns:cx4="http://schemas.microsoft.com/office/drawing/2016/5/10/chartex" xmlns:cx5="http://schemas.microsoft.com/office/drawing/2016/5/11/chartex" xmlns:cx6="http://schemas.microsoft.com/office/drawing/2016/5/12/chartex" xmlns:cx7="http://schemas.microsoft.com/office/drawing/2016/5/13/chartex" xmlns:cx8="http://schemas.microsoft.com/office/drawing/2016/5/14/chartex" xmlns:mc="http://schemas.openxmlformats.org/markup-compatibility/2006" xmlns:aink="http://schemas.microsoft.com/office/drawing/2016/ink" xmlns:am3d="http://schemas.microsoft.com/office/drawing/2017/model3d" xmlns:o="urn:schemas-microsoft-com:office:office" xmlns:oel="http://schemas.microsoft.com/office/2019/extlst" xmlns:r="http://schemas.openxmlformats.org/officeDocument/2006/relationships" xmlns:m="http://schemas.openxmlformats.org/officeDocument/2006/math" xmlns:v="urn:schemas-microsoft-com:vml" xmlns:wp14="http://schemas.microsoft.com/office/word/2010/wordprocessingDrawing" xmlns:wp="http://schemas.openxmlformats.org/drawingml/2006/wordprocessingDrawing" xmlns:w10="urn:schemas-microsoft-com:office:word" xmlns:w="http://schemas.openxmlformats.org/wordprocessingml/2006/main" xmlns:w14="http://schemas.microsoft.com/office/word/2010/wordml" xmlns:w15="http://schemas.microsoft.com/office/word/2012/wordml" xmlns:w16cex="http://schemas.microsoft.com/office/word/2018/wordml/cex" xmlns:w16cid="http://schemas.microsoft.com/office/word/2016/wordml/cid" xmlns:w16="http://schemas.microsoft.com/office/word/2018/wordml" xmlns:w16du="http://schemas.microsoft.com/office/word/2023/wordml/word16du" xmlns:w16sdtdh="http://schemas.microsoft.com/office/word/2020/wordml/sdtdatahash" xmlns:w16sdtfl="http://schemas.microsoft.com/office/word/2024/wordml/sdtformatlock" xmlns:w16se="http://schemas.microsoft.com/office/word/2015/wordml/symex" xmlns:wpg="http://schemas.microsoft.com/office/word/2010/wordprocessingGroup" xmlns:wpi="http://schemas.microsoft.com/office/word/2010/wordprocessingInk" xmlns:wne="http://schemas.microsoft.com/office/word/2006/wordml" xmlns:wps="http://schemas.microsoft.com/office/word/2010/wordprocessingShape" mc:Ignorable="w14 w15 w16se w16cid w16 w16cex w16sdtdh w16sdtfl w16du wp14">
   <w:p>
     <w:pPr>
-      <w:pStyle w:val="Corpodetexto"/>
+      <w:pStyle w:val="BodyText"/>
       <w:spacing w:line="14" w:lineRule="auto"/>
     </w:pPr>
     <w:r>
@@ -20041,7 +21371,7 @@
 <w:hdr xmlns:wpc="http://schemas.microsoft.com/office/word/2010/wordprocessingCanvas" xmlns:cx="http://schemas.microsoft.com/office/drawing/2014/chartex" xmlns:cx1="http://schemas.microsoft.com/office/drawing/2015/9/8/chartex" xmlns:cx2="http://schemas.microsoft.com/office/drawing/2015/10/21/chartex" xmlns:cx3="http://schemas.microsoft.com/office/drawing/2016/5/9/chartex" xmlns:cx4="http://schemas.microsoft.com/office/drawing/2016/5/10/chartex" xmlns:cx5="http://schemas.microsoft.com/office/drawing/2016/5/11/chartex" xmlns:cx6="http://schemas.microsoft.com/office/drawing/2016/5/12/chartex" xmlns:cx7="http://schemas.microsoft.com/office/drawing/2016/5/13/chartex" xmlns:cx8="http://schemas.microsoft.com/office/drawing/2016/5/14/chartex" xmlns:mc="http://schemas.openxmlformats.org/markup-compatibility/2006" xmlns:aink="http://schemas.microsoft.com/office/drawing/2016/ink" xmlns:am3d="http://schemas.microsoft.com/office/drawing/2017/model3d" xmlns:o="urn:schemas-microsoft-com:office:office" xmlns:oel="http://schemas.microsoft.com/office/2019/extlst" xmlns:r="http://schemas.openxmlformats.org/officeDocument/2006/relationships" xmlns:m="http://schemas.openxmlformats.org/officeDocument/2006/math" xmlns:v="urn:schemas-microsoft-com:vml" xmlns:wp14="http://schemas.microsoft.com/office/word/2010/wordprocessingDrawing" xmlns:wp="http://schemas.openxmlformats.org/drawingml/2006/wordprocessingDrawing" xmlns:w10="urn:schemas-microsoft-com:office:word" xmlns:w="http://schemas.openxmlformats.org/wordprocessingml/2006/main" xmlns:w14="http://schemas.microsoft.com/office/word/2010/wordml" xmlns:w15="http://schemas.microsoft.com/office/word/2012/wordml" xmlns:w16cex="http://schemas.microsoft.com/office/word/2018/wordml/cex" xmlns:w16cid="http://schemas.microsoft.com/office/word/2016/wordml/cid" xmlns:w16="http://schemas.microsoft.com/office/word/2018/wordml" xmlns:w16du="http://schemas.microsoft.com/office/word/2023/wordml/word16du" xmlns:w16sdtdh="http://schemas.microsoft.com/office/word/2020/wordml/sdtdatahash" xmlns:w16sdtfl="http://schemas.microsoft.com/office/word/2024/wordml/sdtformatlock" xmlns:w16se="http://schemas.microsoft.com/office/word/2015/wordml/symex" xmlns:wpg="http://schemas.microsoft.com/office/word/2010/wordprocessingGroup" xmlns:wpi="http://schemas.microsoft.com/office/word/2010/wordprocessingInk" xmlns:wne="http://schemas.microsoft.com/office/word/2006/wordml" xmlns:wps="http://schemas.microsoft.com/office/word/2010/wordprocessingShape" mc:Ignorable="w14 w15 w16se w16cid w16 w16cex w16sdtdh w16sdtfl w16du wp14">
   <w:p>
     <w:pPr>
-      <w:pStyle w:val="Cabealho"/>
+      <w:pStyle w:val="Header"/>
       <w:jc w:val="right"/>
     </w:pPr>
     <w:r>
@@ -21259,7 +22589,7 @@
       <w:rFonts w:ascii="Century Gothic" w:eastAsia="Century Gothic" w:hAnsi="Century Gothic" w:cs="Century Gothic"/>
     </w:rPr>
   </w:style>
-  <w:style w:type="paragraph" w:styleId="Ttulo1">
+  <w:style w:type="paragraph" w:styleId="Heading1">
     <w:name w:val="heading 1"/>
     <w:basedOn w:val="Normal"/>
     <w:uiPriority w:val="9"/>
@@ -21275,7 +22605,7 @@
       <w:bCs/>
     </w:rPr>
   </w:style>
-  <w:style w:type="paragraph" w:styleId="Ttulo2">
+  <w:style w:type="paragraph" w:styleId="Heading2">
     <w:name w:val="heading 2"/>
     <w:basedOn w:val="Normal"/>
     <w:uiPriority w:val="9"/>
@@ -21294,11 +22624,11 @@
       <w:szCs w:val="20"/>
     </w:rPr>
   </w:style>
-  <w:style w:type="paragraph" w:styleId="Ttulo8">
+  <w:style w:type="paragraph" w:styleId="Heading8">
     <w:name w:val="heading 8"/>
     <w:basedOn w:val="Normal"/>
     <w:next w:val="Normal"/>
-    <w:link w:val="Ttulo8Carter"/>
+    <w:link w:val="Heading8Char"/>
     <w:uiPriority w:val="9"/>
     <w:semiHidden/>
     <w:unhideWhenUsed/>
@@ -21317,13 +22647,13 @@
       <w:szCs w:val="21"/>
     </w:rPr>
   </w:style>
-  <w:style w:type="character" w:default="1" w:styleId="Tipodeletrapredefinidodopargrafo">
+  <w:style w:type="character" w:default="1" w:styleId="DefaultParagraphFont">
     <w:name w:val="Default Paragraph Font"/>
     <w:uiPriority w:val="1"/>
     <w:semiHidden/>
     <w:unhideWhenUsed/>
   </w:style>
-  <w:style w:type="table" w:default="1" w:styleId="Tabelanormal">
+  <w:style w:type="table" w:default="1" w:styleId="TableNormal">
     <w:name w:val="Normal Table"/>
     <w:uiPriority w:val="99"/>
     <w:semiHidden/>
@@ -21338,7 +22668,7 @@
       </w:tblCellMar>
     </w:tblPr>
   </w:style>
-  <w:style w:type="numbering" w:default="1" w:styleId="Semlista">
+  <w:style w:type="numbering" w:default="1" w:styleId="NoList">
     <w:name w:val="No List"/>
     <w:uiPriority w:val="99"/>
     <w:semiHidden/>
@@ -21360,7 +22690,7 @@
       </w:tblCellMar>
     </w:tblPr>
   </w:style>
-  <w:style w:type="paragraph" w:styleId="Corpodetexto">
+  <w:style w:type="paragraph" w:styleId="BodyText">
     <w:name w:val="Body Text"/>
     <w:basedOn w:val="Normal"/>
     <w:uiPriority w:val="1"/>
@@ -21370,10 +22700,10 @@
       <w:szCs w:val="20"/>
     </w:rPr>
   </w:style>
-  <w:style w:type="paragraph" w:styleId="Ttulo">
+  <w:style w:type="paragraph" w:styleId="Title">
     <w:name w:val="Title"/>
     <w:basedOn w:val="Normal"/>
-    <w:link w:val="TtuloCarter"/>
+    <w:link w:val="TitleChar"/>
     <w:uiPriority w:val="10"/>
     <w:qFormat/>
     <w:pPr>
@@ -21387,7 +22717,7 @@
       <w:szCs w:val="40"/>
     </w:rPr>
   </w:style>
-  <w:style w:type="paragraph" w:styleId="PargrafodaLista">
+  <w:style w:type="paragraph" w:styleId="ListParagraph">
     <w:name w:val="List Paragraph"/>
     <w:basedOn w:val="Normal"/>
     <w:uiPriority w:val="34"/>
@@ -21402,9 +22732,9 @@
     <w:uiPriority w:val="1"/>
     <w:qFormat/>
   </w:style>
-  <w:style w:type="character" w:styleId="Hiperligao">
+  <w:style w:type="character" w:styleId="Hyperlink">
     <w:name w:val="Hyperlink"/>
-    <w:basedOn w:val="Tipodeletrapredefinidodopargrafo"/>
+    <w:basedOn w:val="DefaultParagraphFont"/>
     <w:uiPriority w:val="99"/>
     <w:unhideWhenUsed/>
     <w:rsid w:val="00A64E13"/>
@@ -21413,9 +22743,9 @@
       <w:u w:val="single"/>
     </w:rPr>
   </w:style>
-  <w:style w:type="character" w:styleId="MenoNoResolvida">
+  <w:style w:type="character" w:styleId="UnresolvedMention">
     <w:name w:val="Unresolved Mention"/>
-    <w:basedOn w:val="Tipodeletrapredefinidodopargrafo"/>
+    <w:basedOn w:val="DefaultParagraphFont"/>
     <w:uiPriority w:val="99"/>
     <w:semiHidden/>
     <w:unhideWhenUsed/>
@@ -21427,13 +22757,13 @@
   </w:style>
   <w:style w:type="character" w:customStyle="1" w:styleId="q4iawc">
     <w:name w:val="q4iawc"/>
-    <w:basedOn w:val="Tipodeletrapredefinidodopargrafo"/>
+    <w:basedOn w:val="DefaultParagraphFont"/>
     <w:rsid w:val="00DA0D5F"/>
   </w:style>
-  <w:style w:type="paragraph" w:styleId="Cabealho">
+  <w:style w:type="paragraph" w:styleId="Header">
     <w:name w:val="header"/>
     <w:basedOn w:val="Normal"/>
-    <w:link w:val="CabealhoCarter"/>
+    <w:link w:val="HeaderChar"/>
     <w:uiPriority w:val="99"/>
     <w:unhideWhenUsed/>
     <w:rsid w:val="00107A08"/>
@@ -21444,20 +22774,20 @@
       </w:tabs>
     </w:pPr>
   </w:style>
-  <w:style w:type="character" w:customStyle="1" w:styleId="CabealhoCarter">
-    <w:name w:val="Cabeçalho Caráter"/>
-    <w:basedOn w:val="Tipodeletrapredefinidodopargrafo"/>
-    <w:link w:val="Cabealho"/>
+  <w:style w:type="character" w:customStyle="1" w:styleId="HeaderChar">
+    <w:name w:val="Header Char"/>
+    <w:basedOn w:val="DefaultParagraphFont"/>
+    <w:link w:val="Header"/>
     <w:uiPriority w:val="99"/>
     <w:rsid w:val="00107A08"/>
     <w:rPr>
       <w:rFonts w:ascii="Century Gothic" w:eastAsia="Century Gothic" w:hAnsi="Century Gothic" w:cs="Century Gothic"/>
     </w:rPr>
   </w:style>
-  <w:style w:type="paragraph" w:styleId="Rodap">
+  <w:style w:type="paragraph" w:styleId="Footer">
     <w:name w:val="footer"/>
     <w:basedOn w:val="Normal"/>
-    <w:link w:val="RodapCarter"/>
+    <w:link w:val="FooterChar"/>
     <w:uiPriority w:val="99"/>
     <w:unhideWhenUsed/>
     <w:rsid w:val="00107A08"/>
@@ -21468,10 +22798,10 @@
       </w:tabs>
     </w:pPr>
   </w:style>
-  <w:style w:type="character" w:customStyle="1" w:styleId="RodapCarter">
-    <w:name w:val="Rodapé Caráter"/>
-    <w:basedOn w:val="Tipodeletrapredefinidodopargrafo"/>
-    <w:link w:val="Rodap"/>
+  <w:style w:type="character" w:customStyle="1" w:styleId="FooterChar">
+    <w:name w:val="Footer Char"/>
+    <w:basedOn w:val="DefaultParagraphFont"/>
+    <w:link w:val="Footer"/>
     <w:uiPriority w:val="99"/>
     <w:rsid w:val="00107A08"/>
     <w:rPr>
@@ -21480,12 +22810,12 @@
   </w:style>
   <w:style w:type="character" w:customStyle="1" w:styleId="rynqvb">
     <w:name w:val="rynqvb"/>
-    <w:basedOn w:val="Tipodeletrapredefinidodopargrafo"/>
+    <w:basedOn w:val="DefaultParagraphFont"/>
     <w:rsid w:val="00462A98"/>
   </w:style>
-  <w:style w:type="table" w:styleId="TabelacomGrelha">
+  <w:style w:type="table" w:styleId="TableGrid">
     <w:name w:val="Table Grid"/>
-    <w:basedOn w:val="Tabelanormal"/>
+    <w:basedOn w:val="TableNormal"/>
     <w:uiPriority w:val="39"/>
     <w:rsid w:val="008258E6"/>
     <w:pPr>
@@ -21509,13 +22839,13 @@
   </w:style>
   <w:style w:type="character" w:customStyle="1" w:styleId="tlid-translation">
     <w:name w:val="tlid-translation"/>
-    <w:basedOn w:val="Tipodeletrapredefinidodopargrafo"/>
+    <w:basedOn w:val="DefaultParagraphFont"/>
     <w:rsid w:val="008258E6"/>
   </w:style>
-  <w:style w:type="character" w:customStyle="1" w:styleId="Ttulo8Carter">
-    <w:name w:val="Título 8 Caráter"/>
-    <w:basedOn w:val="Tipodeletrapredefinidodopargrafo"/>
-    <w:link w:val="Ttulo8"/>
+  <w:style w:type="character" w:customStyle="1" w:styleId="Heading8Char">
+    <w:name w:val="Heading 8 Char"/>
+    <w:basedOn w:val="DefaultParagraphFont"/>
+    <w:link w:val="Heading8"/>
     <w:uiPriority w:val="9"/>
     <w:semiHidden/>
     <w:rsid w:val="008950D9"/>
@@ -21526,10 +22856,10 @@
       <w:szCs w:val="21"/>
     </w:rPr>
   </w:style>
-  <w:style w:type="character" w:customStyle="1" w:styleId="TtuloCarter">
-    <w:name w:val="Título Caráter"/>
-    <w:basedOn w:val="Tipodeletrapredefinidodopargrafo"/>
-    <w:link w:val="Ttulo"/>
+  <w:style w:type="character" w:customStyle="1" w:styleId="TitleChar">
+    <w:name w:val="Title Char"/>
+    <w:basedOn w:val="DefaultParagraphFont"/>
+    <w:link w:val="Title"/>
     <w:uiPriority w:val="10"/>
     <w:rsid w:val="00E24A3A"/>
     <w:rPr>

</xml_diff>